<commit_message>
feat: rename Volunteering to Leadership and Volunteering
Closes #16
</commit_message>
<xml_diff>
--- a/cv/cv.docx
+++ b/cv/cv.docx
@@ -32,7 +32,7 @@
         </w:rPr>
         <w:t xml:space="preserve">  |  </w:t>
       </w:r>
-      <w:hyperlink w:history="1" r:id="rId8qydbccz5k4atnhcu9syn">
+      <w:hyperlink w:history="1" r:id="rIdknojnllinuxpfg-eqrzhd">
         <w:r>
           <w:rPr>
             <w:rStyle w:val="Hyperlink"/>
@@ -51,7 +51,7 @@
         </w:rPr>
         <w:t xml:space="preserve">  |  </w:t>
       </w:r>
-      <w:hyperlink w:history="1" r:id="rIddvjxlvdc4ovhpgg1mkyif">
+      <w:hyperlink w:history="1" r:id="rIdrvijdxsdkz-kpdgeg-cx9">
         <w:r>
           <w:rPr>
             <w:rStyle w:val="Hyperlink"/>
@@ -67,7 +67,7 @@
       <w:pPr>
         <w:spacing w:after="60"/>
       </w:pPr>
-      <w:hyperlink w:history="1" r:id="rIdypamcxg02po-8myclvvzs">
+      <w:hyperlink w:history="1" r:id="rIdawqdvze_4anxwhatmw5jf">
         <w:r>
           <w:rPr>
             <w:rStyle w:val="Hyperlink"/>
@@ -86,7 +86,7 @@
         </w:rPr>
         <w:t xml:space="preserve">  |  </w:t>
       </w:r>
-      <w:hyperlink w:history="1" r:id="rIdvowxaubohhgjm_z100a4o">
+      <w:hyperlink w:history="1" r:id="rIdpck3uhjqchglb0fzx_bda">
         <w:r>
           <w:rPr>
             <w:rStyle w:val="Hyperlink"/>
@@ -105,7 +105,7 @@
         </w:rPr>
         <w:t xml:space="preserve">  |  </w:t>
       </w:r>
-      <w:hyperlink w:history="1" r:id="rIdn2ck9ixd72extq2qbhw7m">
+      <w:hyperlink w:history="1" r:id="rIdak7ppe6gb9rzvehxliscx">
         <w:r>
           <w:rPr>
             <w:rStyle w:val="Hyperlink"/>
@@ -533,7 +533,7 @@
         </w:rPr>
         <w:t xml:space="preserve">	</w:t>
       </w:r>
-      <w:hyperlink w:history="1" r:id="rIdnigtlyzwieovlkdpx-w1o">
+      <w:hyperlink w:history="1" r:id="rId1b6ew-a1l8ptlbl83kamt">
         <w:r>
           <w:rPr>
             <w:rStyle w:val="Hyperlink"/>
@@ -552,7 +552,7 @@
         </w:rPr>
         <w:t xml:space="preserve"> | </w:t>
       </w:r>
-      <w:hyperlink w:history="1" r:id="rIdcxbxlfuxs59xkyquxvirp">
+      <w:hyperlink w:history="1" r:id="rId4fb8tiw1rzxcvjf59oswq">
         <w:r>
           <w:rPr>
             <w:rStyle w:val="Hyperlink"/>
@@ -571,7 +571,7 @@
         </w:rPr>
         <w:t xml:space="preserve"> | </w:t>
       </w:r>
-      <w:hyperlink w:history="1" r:id="rIdsfzo5rpyivjuw_skakoxv">
+      <w:hyperlink w:history="1" r:id="rIdd4e_uea7urempenwewlcu">
         <w:r>
           <w:rPr>
             <w:rStyle w:val="Hyperlink"/>
@@ -689,7 +689,7 @@
         </w:rPr>
         <w:t xml:space="preserve">	</w:t>
       </w:r>
-      <w:hyperlink w:history="1" r:id="rIdyrfkpqu4srncaynvq1ahd">
+      <w:hyperlink w:history="1" r:id="rIdyockgyo8mzdja9cxotbuf">
         <w:r>
           <w:rPr>
             <w:rStyle w:val="Hyperlink"/>
@@ -708,7 +708,7 @@
         </w:rPr>
         <w:t xml:space="preserve"> | </w:t>
       </w:r>
-      <w:hyperlink w:history="1" r:id="rIdlzvmwy3dbubxjauy3imdb">
+      <w:hyperlink w:history="1" r:id="rIduursmygyfaxqb1ahoiwio">
         <w:r>
           <w:rPr>
             <w:rStyle w:val="Hyperlink"/>
@@ -826,7 +826,7 @@
         </w:rPr>
         <w:t xml:space="preserve">	</w:t>
       </w:r>
-      <w:hyperlink w:history="1" r:id="rIdl7znn0td0totzs_tvarut">
+      <w:hyperlink w:history="1" r:id="rIdkeg5ur1dgjfmzs9estshw">
         <w:r>
           <w:rPr>
             <w:rStyle w:val="Hyperlink"/>
@@ -1134,7 +1134,7 @@
         </w:rPr>
         <w:t xml:space="preserve">	</w:t>
       </w:r>
-      <w:hyperlink w:history="1" r:id="rIdmj0myci5skewka_ne-qnd">
+      <w:hyperlink w:history="1" r:id="rIdv1jkqhuoxxwj3ljcl7gwe">
         <w:r>
           <w:rPr>
             <w:rStyle w:val="Hyperlink"/>
@@ -1153,7 +1153,7 @@
         </w:rPr>
         <w:t xml:space="preserve"> | </w:t>
       </w:r>
-      <w:hyperlink w:history="1" r:id="rIdfzyaynvcnzb5ulrdm6tlo">
+      <w:hyperlink w:history="1" r:id="rIdpskdtapibzsoveh67ny9u">
         <w:r>
           <w:rPr>
             <w:rStyle w:val="Hyperlink"/>
@@ -1227,7 +1227,7 @@
           <w:sz w:val="23"/>
           <w:szCs w:val="23"/>
         </w:rPr>
-        <w:t xml:space="preserve">Volunteering</w:t>
+        <w:t xml:space="preserve">Leadership and Volunteering</w:t>
       </w:r>
     </w:p>
     <w:p>
@@ -1246,7 +1246,7 @@
           <w:sz w:val="20"/>
           <w:szCs w:val="20"/>
         </w:rPr>
-        <w:t xml:space="preserve">Volunteer Role</w:t>
+        <w:t xml:space="preserve">Society or Volunteer Role</w:t>
       </w:r>
       <w:r>
         <w:rPr>
@@ -1307,7 +1307,7 @@
           <w:sz w:val="19"/>
           <w:szCs w:val="19"/>
         </w:rPr>
-        <w:t xml:space="preserve">What you do and who it helps</w:t>
+        <w:t xml:space="preserve">What you lead or do and who it helps, with a number where you have one</w:t>
       </w:r>
     </w:p>
     <w:p>
@@ -1391,7 +1391,7 @@
         </w:rPr>
         <w:t xml:space="preserve">: </w:t>
       </w:r>
-      <w:hyperlink w:history="1" r:id="rIdrw_4avz5rq3xugqjsrzyb">
+      <w:hyperlink w:history="1" r:id="rIdo4zt--xo-tgs6q9e_ig-j">
         <w:r>
           <w:rPr>
             <w:rStyle w:val="Hyperlink"/>

</xml_diff>

<commit_message>
feat: rename Volunteering to Leadership and Volunteering (#17)
Closes #16
</commit_message>
<xml_diff>
--- a/cv/cv.docx
+++ b/cv/cv.docx
@@ -32,7 +32,7 @@
         </w:rPr>
         <w:t xml:space="preserve">  |  </w:t>
       </w:r>
-      <w:hyperlink w:history="1" r:id="rId8qydbccz5k4atnhcu9syn">
+      <w:hyperlink w:history="1" r:id="rIdknojnllinuxpfg-eqrzhd">
         <w:r>
           <w:rPr>
             <w:rStyle w:val="Hyperlink"/>
@@ -51,7 +51,7 @@
         </w:rPr>
         <w:t xml:space="preserve">  |  </w:t>
       </w:r>
-      <w:hyperlink w:history="1" r:id="rIddvjxlvdc4ovhpgg1mkyif">
+      <w:hyperlink w:history="1" r:id="rIdrvijdxsdkz-kpdgeg-cx9">
         <w:r>
           <w:rPr>
             <w:rStyle w:val="Hyperlink"/>
@@ -67,7 +67,7 @@
       <w:pPr>
         <w:spacing w:after="60"/>
       </w:pPr>
-      <w:hyperlink w:history="1" r:id="rIdypamcxg02po-8myclvvzs">
+      <w:hyperlink w:history="1" r:id="rIdawqdvze_4anxwhatmw5jf">
         <w:r>
           <w:rPr>
             <w:rStyle w:val="Hyperlink"/>
@@ -86,7 +86,7 @@
         </w:rPr>
         <w:t xml:space="preserve">  |  </w:t>
       </w:r>
-      <w:hyperlink w:history="1" r:id="rIdvowxaubohhgjm_z100a4o">
+      <w:hyperlink w:history="1" r:id="rIdpck3uhjqchglb0fzx_bda">
         <w:r>
           <w:rPr>
             <w:rStyle w:val="Hyperlink"/>
@@ -105,7 +105,7 @@
         </w:rPr>
         <w:t xml:space="preserve">  |  </w:t>
       </w:r>
-      <w:hyperlink w:history="1" r:id="rIdn2ck9ixd72extq2qbhw7m">
+      <w:hyperlink w:history="1" r:id="rIdak7ppe6gb9rzvehxliscx">
         <w:r>
           <w:rPr>
             <w:rStyle w:val="Hyperlink"/>
@@ -533,7 +533,7 @@
         </w:rPr>
         <w:t xml:space="preserve">	</w:t>
       </w:r>
-      <w:hyperlink w:history="1" r:id="rIdnigtlyzwieovlkdpx-w1o">
+      <w:hyperlink w:history="1" r:id="rId1b6ew-a1l8ptlbl83kamt">
         <w:r>
           <w:rPr>
             <w:rStyle w:val="Hyperlink"/>
@@ -552,7 +552,7 @@
         </w:rPr>
         <w:t xml:space="preserve"> | </w:t>
       </w:r>
-      <w:hyperlink w:history="1" r:id="rIdcxbxlfuxs59xkyquxvirp">
+      <w:hyperlink w:history="1" r:id="rId4fb8tiw1rzxcvjf59oswq">
         <w:r>
           <w:rPr>
             <w:rStyle w:val="Hyperlink"/>
@@ -571,7 +571,7 @@
         </w:rPr>
         <w:t xml:space="preserve"> | </w:t>
       </w:r>
-      <w:hyperlink w:history="1" r:id="rIdsfzo5rpyivjuw_skakoxv">
+      <w:hyperlink w:history="1" r:id="rIdd4e_uea7urempenwewlcu">
         <w:r>
           <w:rPr>
             <w:rStyle w:val="Hyperlink"/>
@@ -689,7 +689,7 @@
         </w:rPr>
         <w:t xml:space="preserve">	</w:t>
       </w:r>
-      <w:hyperlink w:history="1" r:id="rIdyrfkpqu4srncaynvq1ahd">
+      <w:hyperlink w:history="1" r:id="rIdyockgyo8mzdja9cxotbuf">
         <w:r>
           <w:rPr>
             <w:rStyle w:val="Hyperlink"/>
@@ -708,7 +708,7 @@
         </w:rPr>
         <w:t xml:space="preserve"> | </w:t>
       </w:r>
-      <w:hyperlink w:history="1" r:id="rIdlzvmwy3dbubxjauy3imdb">
+      <w:hyperlink w:history="1" r:id="rIduursmygyfaxqb1ahoiwio">
         <w:r>
           <w:rPr>
             <w:rStyle w:val="Hyperlink"/>
@@ -826,7 +826,7 @@
         </w:rPr>
         <w:t xml:space="preserve">	</w:t>
       </w:r>
-      <w:hyperlink w:history="1" r:id="rIdl7znn0td0totzs_tvarut">
+      <w:hyperlink w:history="1" r:id="rIdkeg5ur1dgjfmzs9estshw">
         <w:r>
           <w:rPr>
             <w:rStyle w:val="Hyperlink"/>
@@ -1134,7 +1134,7 @@
         </w:rPr>
         <w:t xml:space="preserve">	</w:t>
       </w:r>
-      <w:hyperlink w:history="1" r:id="rIdmj0myci5skewka_ne-qnd">
+      <w:hyperlink w:history="1" r:id="rIdv1jkqhuoxxwj3ljcl7gwe">
         <w:r>
           <w:rPr>
             <w:rStyle w:val="Hyperlink"/>
@@ -1153,7 +1153,7 @@
         </w:rPr>
         <w:t xml:space="preserve"> | </w:t>
       </w:r>
-      <w:hyperlink w:history="1" r:id="rIdfzyaynvcnzb5ulrdm6tlo">
+      <w:hyperlink w:history="1" r:id="rIdpskdtapibzsoveh67ny9u">
         <w:r>
           <w:rPr>
             <w:rStyle w:val="Hyperlink"/>
@@ -1227,7 +1227,7 @@
           <w:sz w:val="23"/>
           <w:szCs w:val="23"/>
         </w:rPr>
-        <w:t xml:space="preserve">Volunteering</w:t>
+        <w:t xml:space="preserve">Leadership and Volunteering</w:t>
       </w:r>
     </w:p>
     <w:p>
@@ -1246,7 +1246,7 @@
           <w:sz w:val="20"/>
           <w:szCs w:val="20"/>
         </w:rPr>
-        <w:t xml:space="preserve">Volunteer Role</w:t>
+        <w:t xml:space="preserve">Society or Volunteer Role</w:t>
       </w:r>
       <w:r>
         <w:rPr>
@@ -1307,7 +1307,7 @@
           <w:sz w:val="19"/>
           <w:szCs w:val="19"/>
         </w:rPr>
-        <w:t xml:space="preserve">What you do and who it helps</w:t>
+        <w:t xml:space="preserve">What you lead or do and who it helps, with a number where you have one</w:t>
       </w:r>
     </w:p>
     <w:p>
@@ -1391,7 +1391,7 @@
         </w:rPr>
         <w:t xml:space="preserve">: </w:t>
       </w:r>
-      <w:hyperlink w:history="1" r:id="rIdrw_4avz5rq3xugqjsrzyb">
+      <w:hyperlink w:history="1" r:id="rIdo4zt--xo-tgs6q9e_ig-j">
         <w:r>
           <w:rPr>
             <w:rStyle w:val="Hyperlink"/>

</xml_diff>

<commit_message>
feat: put Research after Projects and line up every date
Closes #18
</commit_message>
<xml_diff>
--- a/cv/cv.docx
+++ b/cv/cv.docx
@@ -32,7 +32,7 @@
         </w:rPr>
         <w:t xml:space="preserve">  |  </w:t>
       </w:r>
-      <w:hyperlink w:history="1" r:id="rIdknojnllinuxpfg-eqrzhd">
+      <w:hyperlink w:history="1" r:id="rIdwqkrfh6qamizazbizrorn">
         <w:r>
           <w:rPr>
             <w:rStyle w:val="Hyperlink"/>
@@ -51,7 +51,7 @@
         </w:rPr>
         <w:t xml:space="preserve">  |  </w:t>
       </w:r>
-      <w:hyperlink w:history="1" r:id="rIdrvijdxsdkz-kpdgeg-cx9">
+      <w:hyperlink w:history="1" r:id="rIdsfbal76tvtsgjjknl6a3l">
         <w:r>
           <w:rPr>
             <w:rStyle w:val="Hyperlink"/>
@@ -67,7 +67,7 @@
       <w:pPr>
         <w:spacing w:after="60"/>
       </w:pPr>
-      <w:hyperlink w:history="1" r:id="rIdawqdvze_4anxwhatmw5jf">
+      <w:hyperlink w:history="1" r:id="rId_khs0qr_r7ri4wdhmjkm4">
         <w:r>
           <w:rPr>
             <w:rStyle w:val="Hyperlink"/>
@@ -86,7 +86,7 @@
         </w:rPr>
         <w:t xml:space="preserve">  |  </w:t>
       </w:r>
-      <w:hyperlink w:history="1" r:id="rIdpck3uhjqchglb0fzx_bda">
+      <w:hyperlink w:history="1" r:id="rIdtp_9e_7ul2aml8bo28xhb">
         <w:r>
           <w:rPr>
             <w:rStyle w:val="Hyperlink"/>
@@ -105,7 +105,7 @@
         </w:rPr>
         <w:t xml:space="preserve">  |  </w:t>
       </w:r>
-      <w:hyperlink w:history="1" r:id="rIdak7ppe6gb9rzvehxliscx">
+      <w:hyperlink w:history="1" r:id="rIdlq8y7bxrtgrs4j-grq8x4">
         <w:r>
           <w:rPr>
             <w:rStyle w:val="Hyperlink"/>
@@ -169,7 +169,7 @@
           <w:sz w:val="19"/>
           <w:szCs w:val="19"/>
         </w:rPr>
-        <w:t xml:space="preserve">Expected Month Year</w:t>
+        <w:t xml:space="preserve"/>
       </w:r>
     </w:p>
     <w:p>
@@ -197,7 +197,7 @@
           <w:sz w:val="19"/>
           <w:szCs w:val="19"/>
         </w:rPr>
-        <w:t xml:space="preserve">	</w:t>
+        <w:t xml:space="preserve">	Expected Month Year</w:t>
       </w:r>
     </w:p>
     <w:p>
@@ -310,7 +310,7 @@
           <w:sz w:val="19"/>
           <w:szCs w:val="19"/>
         </w:rPr>
-        <w:t xml:space="preserve">Month Year - Month Year</w:t>
+        <w:t xml:space="preserve"/>
       </w:r>
     </w:p>
     <w:p>
@@ -404,7 +404,7 @@
           <w:sz w:val="19"/>
           <w:szCs w:val="19"/>
         </w:rPr>
-        <w:t xml:space="preserve">	</w:t>
+        <w:t xml:space="preserve">	Month Year - Month Year</w:t>
       </w:r>
     </w:p>
     <w:p>
@@ -533,7 +533,7 @@
         </w:rPr>
         <w:t xml:space="preserve">	</w:t>
       </w:r>
-      <w:hyperlink w:history="1" r:id="rId1b6ew-a1l8ptlbl83kamt">
+      <w:hyperlink w:history="1" r:id="rIdvngkahydhlabbcmqwb9dr">
         <w:r>
           <w:rPr>
             <w:rStyle w:val="Hyperlink"/>
@@ -552,7 +552,7 @@
         </w:rPr>
         <w:t xml:space="preserve"> | </w:t>
       </w:r>
-      <w:hyperlink w:history="1" r:id="rId4fb8tiw1rzxcvjf59oswq">
+      <w:hyperlink w:history="1" r:id="rIdxdvbgrfccmmqhdkrhv_kt">
         <w:r>
           <w:rPr>
             <w:rStyle w:val="Hyperlink"/>
@@ -571,7 +571,7 @@
         </w:rPr>
         <w:t xml:space="preserve"> | </w:t>
       </w:r>
-      <w:hyperlink w:history="1" r:id="rIdd4e_uea7urempenwewlcu">
+      <w:hyperlink w:history="1" r:id="rIdrxpuncsffn8u7prae6yvv">
         <w:r>
           <w:rPr>
             <w:rStyle w:val="Hyperlink"/>
@@ -608,7 +608,7 @@
           <w:sz w:val="19"/>
           <w:szCs w:val="19"/>
         </w:rPr>
-        <w:t xml:space="preserve">	Year - Present</w:t>
+        <w:t xml:space="preserve">	Year</w:t>
       </w:r>
     </w:p>
     <w:p>
@@ -689,7 +689,7 @@
         </w:rPr>
         <w:t xml:space="preserve">	</w:t>
       </w:r>
-      <w:hyperlink w:history="1" r:id="rIdyockgyo8mzdja9cxotbuf">
+      <w:hyperlink w:history="1" r:id="rId3y-k0hk1u6jz8m3hlnk8o">
         <w:r>
           <w:rPr>
             <w:rStyle w:val="Hyperlink"/>
@@ -708,7 +708,7 @@
         </w:rPr>
         <w:t xml:space="preserve"> | </w:t>
       </w:r>
-      <w:hyperlink w:history="1" r:id="rIduursmygyfaxqb1ahoiwio">
+      <w:hyperlink w:history="1" r:id="rIdyevmyvghvxac_ctiwwcve">
         <w:r>
           <w:rPr>
             <w:rStyle w:val="Hyperlink"/>
@@ -826,7 +826,7 @@
         </w:rPr>
         <w:t xml:space="preserve">	</w:t>
       </w:r>
-      <w:hyperlink w:history="1" r:id="rIdkeg5ur1dgjfmzs9estshw">
+      <w:hyperlink w:history="1" r:id="rId3ndgwbpavwehafzhf9qwn">
         <w:r>
           <w:rPr>
             <w:rStyle w:val="Hyperlink"/>
@@ -900,7 +900,7 @@
           <w:sz w:val="23"/>
           <w:szCs w:val="23"/>
         </w:rPr>
-        <w:t xml:space="preserve">Experience</w:t>
+        <w:t xml:space="preserve">Research and Publications</w:t>
       </w:r>
     </w:p>
     <w:p>
@@ -919,7 +919,7 @@
           <w:sz w:val="20"/>
           <w:szCs w:val="20"/>
         </w:rPr>
-        <w:t xml:space="preserve">Job Title</w:t>
+        <w:t xml:space="preserve">Publication or Report Title</w:t>
       </w:r>
       <w:r>
         <w:rPr>
@@ -929,212 +929,7 @@
         </w:rPr>
         <w:t xml:space="preserve">	</w:t>
       </w:r>
-      <w:r>
-        <w:rPr>
-          <w:rFonts w:ascii="Arial" w:cs="Arial" w:eastAsia="Arial" w:hAnsi="Arial"/>
-          <w:b/>
-          <w:bCs/>
-          <w:i/>
-          <w:iCs/>
-          <w:sz w:val="19"/>
-          <w:szCs w:val="19"/>
-        </w:rPr>
-        <w:t xml:space="preserve">Organisation Name, City</w:t>
-      </w:r>
-    </w:p>
-    <w:p>
-      <w:pPr>
-        <w:keepNext/>
-        <w:tabs>
-          <w:tab w:val="right" w:pos="10432"/>
-        </w:tabs>
-      </w:pPr>
-      <w:r>
-        <w:rPr>
-          <w:rFonts w:ascii="Arial" w:cs="Arial" w:eastAsia="Arial" w:hAnsi="Arial"/>
-          <w:i/>
-          <w:iCs/>
-          <w:sz w:val="19"/>
-          <w:szCs w:val="19"/>
-        </w:rPr>
-        <w:t xml:space="preserve">Three skills this role used</w:t>
-      </w:r>
-      <w:r>
-        <w:rPr>
-          <w:rFonts w:ascii="Arial" w:cs="Arial" w:eastAsia="Arial" w:hAnsi="Arial"/>
-          <w:i/>
-          <w:iCs/>
-          <w:sz w:val="19"/>
-          <w:szCs w:val="19"/>
-        </w:rPr>
-        <w:t xml:space="preserve">	Month Year - Present</w:t>
-      </w:r>
-    </w:p>
-    <w:p>
-      <w:pPr>
-        <w:pStyle w:val="ListParagraph"/>
-        <w:numPr>
-          <w:ilvl w:val="0"/>
-          <w:numId w:val="2"/>
-        </w:numPr>
-      </w:pPr>
-      <w:r>
-        <w:rPr>
-          <w:rFonts w:ascii="Arial" w:cs="Arial" w:eastAsia="Arial" w:hAnsi="Arial"/>
-          <w:sz w:val="19"/>
-          <w:szCs w:val="19"/>
-        </w:rPr>
-        <w:t xml:space="preserve">Your main responsibility, starting with a verb</w:t>
-      </w:r>
-    </w:p>
-    <w:p>
-      <w:pPr>
-        <w:pStyle w:val="ListParagraph"/>
-        <w:numPr>
-          <w:ilvl w:val="0"/>
-          <w:numId w:val="2"/>
-        </w:numPr>
-      </w:pPr>
-      <w:r>
-        <w:rPr>
-          <w:rFonts w:ascii="Arial" w:cs="Arial" w:eastAsia="Arial" w:hAnsi="Arial"/>
-          <w:sz w:val="19"/>
-          <w:szCs w:val="19"/>
-        </w:rPr>
-        <w:t xml:space="preserve">Something you improved or were trusted with</w:t>
-      </w:r>
-    </w:p>
-    <w:p>
-      <w:pPr>
-        <w:keepNext/>
-        <w:tabs>
-          <w:tab w:val="right" w:pos="10432"/>
-        </w:tabs>
-        <w:spacing w:before="70"/>
-      </w:pPr>
-      <w:r>
-        <w:rPr>
-          <w:rFonts w:ascii="Arial" w:cs="Arial" w:eastAsia="Arial" w:hAnsi="Arial"/>
-          <w:b/>
-          <w:bCs/>
-          <w:sz w:val="20"/>
-          <w:szCs w:val="20"/>
-        </w:rPr>
-        <w:t xml:space="preserve">Job Title (part-time)</w:t>
-      </w:r>
-      <w:r>
-        <w:rPr>
-          <w:rFonts w:ascii="Arial" w:cs="Arial" w:eastAsia="Arial" w:hAnsi="Arial"/>
-          <w:sz w:val="19"/>
-          <w:szCs w:val="19"/>
-        </w:rPr>
-        <w:t xml:space="preserve">	</w:t>
-      </w:r>
-      <w:r>
-        <w:rPr>
-          <w:rFonts w:ascii="Arial" w:cs="Arial" w:eastAsia="Arial" w:hAnsi="Arial"/>
-          <w:b/>
-          <w:bCs/>
-          <w:i/>
-          <w:iCs/>
-          <w:sz w:val="19"/>
-          <w:szCs w:val="19"/>
-        </w:rPr>
-        <w:t xml:space="preserve">Organisation Name, City</w:t>
-      </w:r>
-    </w:p>
-    <w:p>
-      <w:pPr>
-        <w:keepNext/>
-        <w:tabs>
-          <w:tab w:val="right" w:pos="10432"/>
-        </w:tabs>
-      </w:pPr>
-      <w:r>
-        <w:rPr>
-          <w:rFonts w:ascii="Arial" w:cs="Arial" w:eastAsia="Arial" w:hAnsi="Arial"/>
-          <w:i/>
-          <w:iCs/>
-          <w:sz w:val="19"/>
-          <w:szCs w:val="19"/>
-        </w:rPr>
-        <w:t xml:space="preserve">Three skills this role used</w:t>
-      </w:r>
-      <w:r>
-        <w:rPr>
-          <w:rFonts w:ascii="Arial" w:cs="Arial" w:eastAsia="Arial" w:hAnsi="Arial"/>
-          <w:i/>
-          <w:iCs/>
-          <w:sz w:val="19"/>
-          <w:szCs w:val="19"/>
-        </w:rPr>
-        <w:t xml:space="preserve">	Month Year - Month Year</w:t>
-      </w:r>
-    </w:p>
-    <w:p>
-      <w:pPr>
-        <w:pStyle w:val="ListParagraph"/>
-        <w:numPr>
-          <w:ilvl w:val="0"/>
-          <w:numId w:val="2"/>
-        </w:numPr>
-      </w:pPr>
-      <w:r>
-        <w:rPr>
-          <w:rFonts w:ascii="Arial" w:cs="Arial" w:eastAsia="Arial" w:hAnsi="Arial"/>
-          <w:sz w:val="19"/>
-          <w:szCs w:val="19"/>
-        </w:rPr>
-        <w:t xml:space="preserve">Your main responsibility, starting with a verb</w:t>
-      </w:r>
-    </w:p>
-    <w:p>
-      <w:pPr>
-        <w:keepNext/>
-        <w:pBdr>
-          <w:bottom w:val="single" w:color="111111" w:sz="6" w:space="1"/>
-        </w:pBdr>
-        <w:spacing w:after="50" w:before="150"/>
-      </w:pPr>
-      <w:r>
-        <w:rPr>
-          <w:rFonts w:ascii="Arial" w:cs="Arial" w:eastAsia="Arial" w:hAnsi="Arial"/>
-          <w:b/>
-          <w:bCs/>
-          <w:smallCaps/>
-          <w:sz w:val="23"/>
-          <w:szCs w:val="23"/>
-        </w:rPr>
-        <w:t xml:space="preserve">Research and Publications</w:t>
-      </w:r>
-    </w:p>
-    <w:p>
-      <w:pPr>
-        <w:keepNext/>
-        <w:tabs>
-          <w:tab w:val="right" w:pos="10432"/>
-        </w:tabs>
-        <w:spacing w:before="70"/>
-      </w:pPr>
-      <w:r>
-        <w:rPr>
-          <w:rFonts w:ascii="Arial" w:cs="Arial" w:eastAsia="Arial" w:hAnsi="Arial"/>
-          <w:b/>
-          <w:bCs/>
-          <w:sz w:val="20"/>
-          <w:szCs w:val="20"/>
-        </w:rPr>
-        <w:t xml:space="preserve">Publication or Report Title</w:t>
-      </w:r>
-      <w:r>
-        <w:rPr>
-          <w:rFonts w:ascii="Arial" w:cs="Arial" w:eastAsia="Arial" w:hAnsi="Arial"/>
-          <w:sz w:val="19"/>
-          <w:szCs w:val="19"/>
-        </w:rPr>
-        <w:t xml:space="preserve">	</w:t>
-      </w:r>
-      <w:hyperlink w:history="1" r:id="rIdv1jkqhuoxxwj3ljcl7gwe">
+      <w:hyperlink w:history="1" r:id="rIdtnxaylw42kwzp8yrohoxo">
         <w:r>
           <w:rPr>
             <w:rStyle w:val="Hyperlink"/>
@@ -1153,7 +948,7 @@
         </w:rPr>
         <w:t xml:space="preserve"> | </w:t>
       </w:r>
-      <w:hyperlink w:history="1" r:id="rIdpskdtapibzsoveh67ny9u">
+      <w:hyperlink w:history="1" r:id="rIdtr79hj0icqihf3n4mjrfz">
         <w:r>
           <w:rPr>
             <w:rStyle w:val="Hyperlink"/>
@@ -1227,7 +1022,7 @@
           <w:sz w:val="23"/>
           <w:szCs w:val="23"/>
         </w:rPr>
-        <w:t xml:space="preserve">Leadership and Volunteering</w:t>
+        <w:t xml:space="preserve">Experience</w:t>
       </w:r>
     </w:p>
     <w:p>
@@ -1246,7 +1041,7 @@
           <w:sz w:val="20"/>
           <w:szCs w:val="20"/>
         </w:rPr>
-        <w:t xml:space="preserve">Society or Volunteer Role</w:t>
+        <w:t xml:space="preserve">Job Title</w:t>
       </w:r>
       <w:r>
         <w:rPr>
@@ -1259,10 +1054,14 @@
       <w:r>
         <w:rPr>
           <w:rFonts w:ascii="Arial" w:cs="Arial" w:eastAsia="Arial" w:hAnsi="Arial"/>
-          <w:sz w:val="19"/>
-          <w:szCs w:val="19"/>
-        </w:rPr>
-        <w:t xml:space="preserve">Month Year - Present</w:t>
+          <w:b/>
+          <w:bCs/>
+          <w:i/>
+          <w:iCs/>
+          <w:sz w:val="19"/>
+          <w:szCs w:val="19"/>
+        </w:rPr>
+        <w:t xml:space="preserve">Organisation Name, City</w:t>
       </w:r>
     </w:p>
     <w:p>
@@ -1280,17 +1079,17 @@
           <w:sz w:val="19"/>
           <w:szCs w:val="19"/>
         </w:rPr>
-        <w:t xml:space="preserve">Organisation Name</w:t>
-      </w:r>
-      <w:r>
-        <w:rPr>
-          <w:rFonts w:ascii="Arial" w:cs="Arial" w:eastAsia="Arial" w:hAnsi="Arial"/>
-          <w:i/>
-          <w:iCs/>
-          <w:sz w:val="19"/>
-          <w:szCs w:val="19"/>
-        </w:rPr>
-        <w:t xml:space="preserve">	</w:t>
+        <w:t xml:space="preserve">Three skills this role used</w:t>
+      </w:r>
+      <w:r>
+        <w:rPr>
+          <w:rFonts w:ascii="Arial" w:cs="Arial" w:eastAsia="Arial" w:hAnsi="Arial"/>
+          <w:i/>
+          <w:iCs/>
+          <w:sz w:val="19"/>
+          <w:szCs w:val="19"/>
+        </w:rPr>
+        <w:t xml:space="preserve">	Month Year - Present</w:t>
       </w:r>
     </w:p>
     <w:p>
@@ -1307,27 +1106,7 @@
           <w:sz w:val="19"/>
           <w:szCs w:val="19"/>
         </w:rPr>
-        <w:t xml:space="preserve">What you lead or do and who it helps, with a number where you have one</w:t>
-      </w:r>
-    </w:p>
-    <w:p>
-      <w:pPr>
-        <w:keepNext/>
-        <w:pBdr>
-          <w:bottom w:val="single" w:color="111111" w:sz="6" w:space="1"/>
-        </w:pBdr>
-        <w:spacing w:after="50" w:before="150"/>
-      </w:pPr>
-      <w:r>
-        <w:rPr>
-          <w:rFonts w:ascii="Arial" w:cs="Arial" w:eastAsia="Arial" w:hAnsi="Arial"/>
-          <w:b/>
-          <w:bCs/>
-          <w:smallCaps/>
-          <w:sz w:val="23"/>
-          <w:szCs w:val="23"/>
-        </w:rPr>
-        <w:t xml:space="preserve">Achievements</w:t>
+        <w:t xml:space="preserve">Your main responsibility, starting with a verb</w:t>
       </w:r>
     </w:p>
     <w:p>
@@ -1341,20 +1120,77 @@
       <w:r>
         <w:rPr>
           <w:rFonts w:ascii="Arial" w:cs="Arial" w:eastAsia="Arial" w:hAnsi="Arial"/>
-          <w:b/>
-          <w:bCs/>
-          <w:sz w:val="19"/>
-          <w:szCs w:val="19"/>
-        </w:rPr>
-        <w:t xml:space="preserve">Award or achievement</w:t>
-      </w:r>
-      <w:r>
-        <w:rPr>
-          <w:rFonts w:ascii="Arial" w:cs="Arial" w:eastAsia="Arial" w:hAnsi="Arial"/>
-          <w:sz w:val="19"/>
-          <w:szCs w:val="19"/>
-        </w:rPr>
-        <w:t xml:space="preserve">, organisation and year</w:t>
+          <w:sz w:val="19"/>
+          <w:szCs w:val="19"/>
+        </w:rPr>
+        <w:t xml:space="preserve">Something you improved or were trusted with</w:t>
+      </w:r>
+    </w:p>
+    <w:p>
+      <w:pPr>
+        <w:keepNext/>
+        <w:tabs>
+          <w:tab w:val="right" w:pos="10432"/>
+        </w:tabs>
+        <w:spacing w:before="70"/>
+      </w:pPr>
+      <w:r>
+        <w:rPr>
+          <w:rFonts w:ascii="Arial" w:cs="Arial" w:eastAsia="Arial" w:hAnsi="Arial"/>
+          <w:b/>
+          <w:bCs/>
+          <w:sz w:val="20"/>
+          <w:szCs w:val="20"/>
+        </w:rPr>
+        <w:t xml:space="preserve">Job Title (part-time)</w:t>
+      </w:r>
+      <w:r>
+        <w:rPr>
+          <w:rFonts w:ascii="Arial" w:cs="Arial" w:eastAsia="Arial" w:hAnsi="Arial"/>
+          <w:sz w:val="19"/>
+          <w:szCs w:val="19"/>
+        </w:rPr>
+        <w:t xml:space="preserve">	</w:t>
+      </w:r>
+      <w:r>
+        <w:rPr>
+          <w:rFonts w:ascii="Arial" w:cs="Arial" w:eastAsia="Arial" w:hAnsi="Arial"/>
+          <w:b/>
+          <w:bCs/>
+          <w:i/>
+          <w:iCs/>
+          <w:sz w:val="19"/>
+          <w:szCs w:val="19"/>
+        </w:rPr>
+        <w:t xml:space="preserve">Organisation Name, City</w:t>
+      </w:r>
+    </w:p>
+    <w:p>
+      <w:pPr>
+        <w:keepNext/>
+        <w:tabs>
+          <w:tab w:val="right" w:pos="10432"/>
+        </w:tabs>
+      </w:pPr>
+      <w:r>
+        <w:rPr>
+          <w:rFonts w:ascii="Arial" w:cs="Arial" w:eastAsia="Arial" w:hAnsi="Arial"/>
+          <w:i/>
+          <w:iCs/>
+          <w:sz w:val="19"/>
+          <w:szCs w:val="19"/>
+        </w:rPr>
+        <w:t xml:space="preserve">Three skills this role used</w:t>
+      </w:r>
+      <w:r>
+        <w:rPr>
+          <w:rFonts w:ascii="Arial" w:cs="Arial" w:eastAsia="Arial" w:hAnsi="Arial"/>
+          <w:i/>
+          <w:iCs/>
+          <w:sz w:val="19"/>
+          <w:szCs w:val="19"/>
+        </w:rPr>
+        <w:t xml:space="preserve">	Month Year - Month Year</w:t>
       </w:r>
     </w:p>
     <w:p>
@@ -1368,6 +1204,164 @@
       <w:r>
         <w:rPr>
           <w:rFonts w:ascii="Arial" w:cs="Arial" w:eastAsia="Arial" w:hAnsi="Arial"/>
+          <w:sz w:val="19"/>
+          <w:szCs w:val="19"/>
+        </w:rPr>
+        <w:t xml:space="preserve">Your main responsibility, starting with a verb</w:t>
+      </w:r>
+    </w:p>
+    <w:p>
+      <w:pPr>
+        <w:keepNext/>
+        <w:pBdr>
+          <w:bottom w:val="single" w:color="111111" w:sz="6" w:space="1"/>
+        </w:pBdr>
+        <w:spacing w:after="50" w:before="150"/>
+      </w:pPr>
+      <w:r>
+        <w:rPr>
+          <w:rFonts w:ascii="Arial" w:cs="Arial" w:eastAsia="Arial" w:hAnsi="Arial"/>
+          <w:b/>
+          <w:bCs/>
+          <w:smallCaps/>
+          <w:sz w:val="23"/>
+          <w:szCs w:val="23"/>
+        </w:rPr>
+        <w:t xml:space="preserve">Leadership and Volunteering</w:t>
+      </w:r>
+    </w:p>
+    <w:p>
+      <w:pPr>
+        <w:keepNext/>
+        <w:tabs>
+          <w:tab w:val="right" w:pos="10432"/>
+        </w:tabs>
+        <w:spacing w:before="70"/>
+      </w:pPr>
+      <w:r>
+        <w:rPr>
+          <w:rFonts w:ascii="Arial" w:cs="Arial" w:eastAsia="Arial" w:hAnsi="Arial"/>
+          <w:b/>
+          <w:bCs/>
+          <w:sz w:val="20"/>
+          <w:szCs w:val="20"/>
+        </w:rPr>
+        <w:t xml:space="preserve">Society or Volunteer Role</w:t>
+      </w:r>
+      <w:r>
+        <w:rPr>
+          <w:rFonts w:ascii="Arial" w:cs="Arial" w:eastAsia="Arial" w:hAnsi="Arial"/>
+          <w:sz w:val="19"/>
+          <w:szCs w:val="19"/>
+        </w:rPr>
+        <w:t xml:space="preserve">	</w:t>
+      </w:r>
+      <w:r>
+        <w:rPr>
+          <w:rFonts w:ascii="Arial" w:cs="Arial" w:eastAsia="Arial" w:hAnsi="Arial"/>
+          <w:b/>
+          <w:bCs/>
+          <w:i/>
+          <w:iCs/>
+          <w:sz w:val="19"/>
+          <w:szCs w:val="19"/>
+        </w:rPr>
+        <w:t xml:space="preserve">Organisation Name</w:t>
+      </w:r>
+    </w:p>
+    <w:p>
+      <w:pPr>
+        <w:keepNext/>
+        <w:tabs>
+          <w:tab w:val="right" w:pos="10432"/>
+        </w:tabs>
+      </w:pPr>
+      <w:r>
+        <w:rPr>
+          <w:rFonts w:ascii="Arial" w:cs="Arial" w:eastAsia="Arial" w:hAnsi="Arial"/>
+          <w:i/>
+          <w:iCs/>
+          <w:sz w:val="19"/>
+          <w:szCs w:val="19"/>
+        </w:rPr>
+        <w:t xml:space="preserve">	Month Year - Present</w:t>
+      </w:r>
+    </w:p>
+    <w:p>
+      <w:pPr>
+        <w:pStyle w:val="ListParagraph"/>
+        <w:numPr>
+          <w:ilvl w:val="0"/>
+          <w:numId w:val="2"/>
+        </w:numPr>
+      </w:pPr>
+      <w:r>
+        <w:rPr>
+          <w:rFonts w:ascii="Arial" w:cs="Arial" w:eastAsia="Arial" w:hAnsi="Arial"/>
+          <w:sz w:val="19"/>
+          <w:szCs w:val="19"/>
+        </w:rPr>
+        <w:t xml:space="preserve">What you lead or do and who it helps, with a number where you have one</w:t>
+      </w:r>
+    </w:p>
+    <w:p>
+      <w:pPr>
+        <w:keepNext/>
+        <w:pBdr>
+          <w:bottom w:val="single" w:color="111111" w:sz="6" w:space="1"/>
+        </w:pBdr>
+        <w:spacing w:after="50" w:before="150"/>
+      </w:pPr>
+      <w:r>
+        <w:rPr>
+          <w:rFonts w:ascii="Arial" w:cs="Arial" w:eastAsia="Arial" w:hAnsi="Arial"/>
+          <w:b/>
+          <w:bCs/>
+          <w:smallCaps/>
+          <w:sz w:val="23"/>
+          <w:szCs w:val="23"/>
+        </w:rPr>
+        <w:t xml:space="preserve">Achievements</w:t>
+      </w:r>
+    </w:p>
+    <w:p>
+      <w:pPr>
+        <w:pStyle w:val="ListParagraph"/>
+        <w:numPr>
+          <w:ilvl w:val="0"/>
+          <w:numId w:val="2"/>
+        </w:numPr>
+      </w:pPr>
+      <w:r>
+        <w:rPr>
+          <w:rFonts w:ascii="Arial" w:cs="Arial" w:eastAsia="Arial" w:hAnsi="Arial"/>
+          <w:b/>
+          <w:bCs/>
+          <w:sz w:val="19"/>
+          <w:szCs w:val="19"/>
+        </w:rPr>
+        <w:t xml:space="preserve">Award or achievement</w:t>
+      </w:r>
+      <w:r>
+        <w:rPr>
+          <w:rFonts w:ascii="Arial" w:cs="Arial" w:eastAsia="Arial" w:hAnsi="Arial"/>
+          <w:sz w:val="19"/>
+          <w:szCs w:val="19"/>
+        </w:rPr>
+        <w:t xml:space="preserve">, organisation and year</w:t>
+      </w:r>
+    </w:p>
+    <w:p>
+      <w:pPr>
+        <w:pStyle w:val="ListParagraph"/>
+        <w:numPr>
+          <w:ilvl w:val="0"/>
+          <w:numId w:val="2"/>
+        </w:numPr>
+      </w:pPr>
+      <w:r>
+        <w:rPr>
+          <w:rFonts w:ascii="Arial" w:cs="Arial" w:eastAsia="Arial" w:hAnsi="Arial"/>
           <w:b/>
           <w:bCs/>
           <w:sz w:val="19"/>
@@ -1391,7 +1385,7 @@
         </w:rPr>
         <w:t xml:space="preserve">: </w:t>
       </w:r>
-      <w:hyperlink w:history="1" r:id="rIdo4zt--xo-tgs6q9e_ig-j">
+      <w:hyperlink w:history="1" r:id="rIdyv0t5oy-0kgwcrslu-il5">
         <w:r>
           <w:rPr>
             <w:rStyle w:val="Hyperlink"/>

</xml_diff>

<commit_message>
feat: put Research after Projects and line up every date (#19)
Closes #18
</commit_message>
<xml_diff>
--- a/cv/cv.docx
+++ b/cv/cv.docx
@@ -32,7 +32,7 @@
         </w:rPr>
         <w:t xml:space="preserve">  |  </w:t>
       </w:r>
-      <w:hyperlink w:history="1" r:id="rIdknojnllinuxpfg-eqrzhd">
+      <w:hyperlink w:history="1" r:id="rIdwqkrfh6qamizazbizrorn">
         <w:r>
           <w:rPr>
             <w:rStyle w:val="Hyperlink"/>
@@ -51,7 +51,7 @@
         </w:rPr>
         <w:t xml:space="preserve">  |  </w:t>
       </w:r>
-      <w:hyperlink w:history="1" r:id="rIdrvijdxsdkz-kpdgeg-cx9">
+      <w:hyperlink w:history="1" r:id="rIdsfbal76tvtsgjjknl6a3l">
         <w:r>
           <w:rPr>
             <w:rStyle w:val="Hyperlink"/>
@@ -67,7 +67,7 @@
       <w:pPr>
         <w:spacing w:after="60"/>
       </w:pPr>
-      <w:hyperlink w:history="1" r:id="rIdawqdvze_4anxwhatmw5jf">
+      <w:hyperlink w:history="1" r:id="rId_khs0qr_r7ri4wdhmjkm4">
         <w:r>
           <w:rPr>
             <w:rStyle w:val="Hyperlink"/>
@@ -86,7 +86,7 @@
         </w:rPr>
         <w:t xml:space="preserve">  |  </w:t>
       </w:r>
-      <w:hyperlink w:history="1" r:id="rIdpck3uhjqchglb0fzx_bda">
+      <w:hyperlink w:history="1" r:id="rIdtp_9e_7ul2aml8bo28xhb">
         <w:r>
           <w:rPr>
             <w:rStyle w:val="Hyperlink"/>
@@ -105,7 +105,7 @@
         </w:rPr>
         <w:t xml:space="preserve">  |  </w:t>
       </w:r>
-      <w:hyperlink w:history="1" r:id="rIdak7ppe6gb9rzvehxliscx">
+      <w:hyperlink w:history="1" r:id="rIdlq8y7bxrtgrs4j-grq8x4">
         <w:r>
           <w:rPr>
             <w:rStyle w:val="Hyperlink"/>
@@ -169,7 +169,7 @@
           <w:sz w:val="19"/>
           <w:szCs w:val="19"/>
         </w:rPr>
-        <w:t xml:space="preserve">Expected Month Year</w:t>
+        <w:t xml:space="preserve"/>
       </w:r>
     </w:p>
     <w:p>
@@ -197,7 +197,7 @@
           <w:sz w:val="19"/>
           <w:szCs w:val="19"/>
         </w:rPr>
-        <w:t xml:space="preserve">	</w:t>
+        <w:t xml:space="preserve">	Expected Month Year</w:t>
       </w:r>
     </w:p>
     <w:p>
@@ -310,7 +310,7 @@
           <w:sz w:val="19"/>
           <w:szCs w:val="19"/>
         </w:rPr>
-        <w:t xml:space="preserve">Month Year - Month Year</w:t>
+        <w:t xml:space="preserve"/>
       </w:r>
     </w:p>
     <w:p>
@@ -404,7 +404,7 @@
           <w:sz w:val="19"/>
           <w:szCs w:val="19"/>
         </w:rPr>
-        <w:t xml:space="preserve">	</w:t>
+        <w:t xml:space="preserve">	Month Year - Month Year</w:t>
       </w:r>
     </w:p>
     <w:p>
@@ -533,7 +533,7 @@
         </w:rPr>
         <w:t xml:space="preserve">	</w:t>
       </w:r>
-      <w:hyperlink w:history="1" r:id="rId1b6ew-a1l8ptlbl83kamt">
+      <w:hyperlink w:history="1" r:id="rIdvngkahydhlabbcmqwb9dr">
         <w:r>
           <w:rPr>
             <w:rStyle w:val="Hyperlink"/>
@@ -552,7 +552,7 @@
         </w:rPr>
         <w:t xml:space="preserve"> | </w:t>
       </w:r>
-      <w:hyperlink w:history="1" r:id="rId4fb8tiw1rzxcvjf59oswq">
+      <w:hyperlink w:history="1" r:id="rIdxdvbgrfccmmqhdkrhv_kt">
         <w:r>
           <w:rPr>
             <w:rStyle w:val="Hyperlink"/>
@@ -571,7 +571,7 @@
         </w:rPr>
         <w:t xml:space="preserve"> | </w:t>
       </w:r>
-      <w:hyperlink w:history="1" r:id="rIdd4e_uea7urempenwewlcu">
+      <w:hyperlink w:history="1" r:id="rIdrxpuncsffn8u7prae6yvv">
         <w:r>
           <w:rPr>
             <w:rStyle w:val="Hyperlink"/>
@@ -608,7 +608,7 @@
           <w:sz w:val="19"/>
           <w:szCs w:val="19"/>
         </w:rPr>
-        <w:t xml:space="preserve">	Year - Present</w:t>
+        <w:t xml:space="preserve">	Year</w:t>
       </w:r>
     </w:p>
     <w:p>
@@ -689,7 +689,7 @@
         </w:rPr>
         <w:t xml:space="preserve">	</w:t>
       </w:r>
-      <w:hyperlink w:history="1" r:id="rIdyockgyo8mzdja9cxotbuf">
+      <w:hyperlink w:history="1" r:id="rId3y-k0hk1u6jz8m3hlnk8o">
         <w:r>
           <w:rPr>
             <w:rStyle w:val="Hyperlink"/>
@@ -708,7 +708,7 @@
         </w:rPr>
         <w:t xml:space="preserve"> | </w:t>
       </w:r>
-      <w:hyperlink w:history="1" r:id="rIduursmygyfaxqb1ahoiwio">
+      <w:hyperlink w:history="1" r:id="rIdyevmyvghvxac_ctiwwcve">
         <w:r>
           <w:rPr>
             <w:rStyle w:val="Hyperlink"/>
@@ -826,7 +826,7 @@
         </w:rPr>
         <w:t xml:space="preserve">	</w:t>
       </w:r>
-      <w:hyperlink w:history="1" r:id="rIdkeg5ur1dgjfmzs9estshw">
+      <w:hyperlink w:history="1" r:id="rId3ndgwbpavwehafzhf9qwn">
         <w:r>
           <w:rPr>
             <w:rStyle w:val="Hyperlink"/>
@@ -900,7 +900,7 @@
           <w:sz w:val="23"/>
           <w:szCs w:val="23"/>
         </w:rPr>
-        <w:t xml:space="preserve">Experience</w:t>
+        <w:t xml:space="preserve">Research and Publications</w:t>
       </w:r>
     </w:p>
     <w:p>
@@ -919,7 +919,7 @@
           <w:sz w:val="20"/>
           <w:szCs w:val="20"/>
         </w:rPr>
-        <w:t xml:space="preserve">Job Title</w:t>
+        <w:t xml:space="preserve">Publication or Report Title</w:t>
       </w:r>
       <w:r>
         <w:rPr>
@@ -929,212 +929,7 @@
         </w:rPr>
         <w:t xml:space="preserve">	</w:t>
       </w:r>
-      <w:r>
-        <w:rPr>
-          <w:rFonts w:ascii="Arial" w:cs="Arial" w:eastAsia="Arial" w:hAnsi="Arial"/>
-          <w:b/>
-          <w:bCs/>
-          <w:i/>
-          <w:iCs/>
-          <w:sz w:val="19"/>
-          <w:szCs w:val="19"/>
-        </w:rPr>
-        <w:t xml:space="preserve">Organisation Name, City</w:t>
-      </w:r>
-    </w:p>
-    <w:p>
-      <w:pPr>
-        <w:keepNext/>
-        <w:tabs>
-          <w:tab w:val="right" w:pos="10432"/>
-        </w:tabs>
-      </w:pPr>
-      <w:r>
-        <w:rPr>
-          <w:rFonts w:ascii="Arial" w:cs="Arial" w:eastAsia="Arial" w:hAnsi="Arial"/>
-          <w:i/>
-          <w:iCs/>
-          <w:sz w:val="19"/>
-          <w:szCs w:val="19"/>
-        </w:rPr>
-        <w:t xml:space="preserve">Three skills this role used</w:t>
-      </w:r>
-      <w:r>
-        <w:rPr>
-          <w:rFonts w:ascii="Arial" w:cs="Arial" w:eastAsia="Arial" w:hAnsi="Arial"/>
-          <w:i/>
-          <w:iCs/>
-          <w:sz w:val="19"/>
-          <w:szCs w:val="19"/>
-        </w:rPr>
-        <w:t xml:space="preserve">	Month Year - Present</w:t>
-      </w:r>
-    </w:p>
-    <w:p>
-      <w:pPr>
-        <w:pStyle w:val="ListParagraph"/>
-        <w:numPr>
-          <w:ilvl w:val="0"/>
-          <w:numId w:val="2"/>
-        </w:numPr>
-      </w:pPr>
-      <w:r>
-        <w:rPr>
-          <w:rFonts w:ascii="Arial" w:cs="Arial" w:eastAsia="Arial" w:hAnsi="Arial"/>
-          <w:sz w:val="19"/>
-          <w:szCs w:val="19"/>
-        </w:rPr>
-        <w:t xml:space="preserve">Your main responsibility, starting with a verb</w:t>
-      </w:r>
-    </w:p>
-    <w:p>
-      <w:pPr>
-        <w:pStyle w:val="ListParagraph"/>
-        <w:numPr>
-          <w:ilvl w:val="0"/>
-          <w:numId w:val="2"/>
-        </w:numPr>
-      </w:pPr>
-      <w:r>
-        <w:rPr>
-          <w:rFonts w:ascii="Arial" w:cs="Arial" w:eastAsia="Arial" w:hAnsi="Arial"/>
-          <w:sz w:val="19"/>
-          <w:szCs w:val="19"/>
-        </w:rPr>
-        <w:t xml:space="preserve">Something you improved or were trusted with</w:t>
-      </w:r>
-    </w:p>
-    <w:p>
-      <w:pPr>
-        <w:keepNext/>
-        <w:tabs>
-          <w:tab w:val="right" w:pos="10432"/>
-        </w:tabs>
-        <w:spacing w:before="70"/>
-      </w:pPr>
-      <w:r>
-        <w:rPr>
-          <w:rFonts w:ascii="Arial" w:cs="Arial" w:eastAsia="Arial" w:hAnsi="Arial"/>
-          <w:b/>
-          <w:bCs/>
-          <w:sz w:val="20"/>
-          <w:szCs w:val="20"/>
-        </w:rPr>
-        <w:t xml:space="preserve">Job Title (part-time)</w:t>
-      </w:r>
-      <w:r>
-        <w:rPr>
-          <w:rFonts w:ascii="Arial" w:cs="Arial" w:eastAsia="Arial" w:hAnsi="Arial"/>
-          <w:sz w:val="19"/>
-          <w:szCs w:val="19"/>
-        </w:rPr>
-        <w:t xml:space="preserve">	</w:t>
-      </w:r>
-      <w:r>
-        <w:rPr>
-          <w:rFonts w:ascii="Arial" w:cs="Arial" w:eastAsia="Arial" w:hAnsi="Arial"/>
-          <w:b/>
-          <w:bCs/>
-          <w:i/>
-          <w:iCs/>
-          <w:sz w:val="19"/>
-          <w:szCs w:val="19"/>
-        </w:rPr>
-        <w:t xml:space="preserve">Organisation Name, City</w:t>
-      </w:r>
-    </w:p>
-    <w:p>
-      <w:pPr>
-        <w:keepNext/>
-        <w:tabs>
-          <w:tab w:val="right" w:pos="10432"/>
-        </w:tabs>
-      </w:pPr>
-      <w:r>
-        <w:rPr>
-          <w:rFonts w:ascii="Arial" w:cs="Arial" w:eastAsia="Arial" w:hAnsi="Arial"/>
-          <w:i/>
-          <w:iCs/>
-          <w:sz w:val="19"/>
-          <w:szCs w:val="19"/>
-        </w:rPr>
-        <w:t xml:space="preserve">Three skills this role used</w:t>
-      </w:r>
-      <w:r>
-        <w:rPr>
-          <w:rFonts w:ascii="Arial" w:cs="Arial" w:eastAsia="Arial" w:hAnsi="Arial"/>
-          <w:i/>
-          <w:iCs/>
-          <w:sz w:val="19"/>
-          <w:szCs w:val="19"/>
-        </w:rPr>
-        <w:t xml:space="preserve">	Month Year - Month Year</w:t>
-      </w:r>
-    </w:p>
-    <w:p>
-      <w:pPr>
-        <w:pStyle w:val="ListParagraph"/>
-        <w:numPr>
-          <w:ilvl w:val="0"/>
-          <w:numId w:val="2"/>
-        </w:numPr>
-      </w:pPr>
-      <w:r>
-        <w:rPr>
-          <w:rFonts w:ascii="Arial" w:cs="Arial" w:eastAsia="Arial" w:hAnsi="Arial"/>
-          <w:sz w:val="19"/>
-          <w:szCs w:val="19"/>
-        </w:rPr>
-        <w:t xml:space="preserve">Your main responsibility, starting with a verb</w:t>
-      </w:r>
-    </w:p>
-    <w:p>
-      <w:pPr>
-        <w:keepNext/>
-        <w:pBdr>
-          <w:bottom w:val="single" w:color="111111" w:sz="6" w:space="1"/>
-        </w:pBdr>
-        <w:spacing w:after="50" w:before="150"/>
-      </w:pPr>
-      <w:r>
-        <w:rPr>
-          <w:rFonts w:ascii="Arial" w:cs="Arial" w:eastAsia="Arial" w:hAnsi="Arial"/>
-          <w:b/>
-          <w:bCs/>
-          <w:smallCaps/>
-          <w:sz w:val="23"/>
-          <w:szCs w:val="23"/>
-        </w:rPr>
-        <w:t xml:space="preserve">Research and Publications</w:t>
-      </w:r>
-    </w:p>
-    <w:p>
-      <w:pPr>
-        <w:keepNext/>
-        <w:tabs>
-          <w:tab w:val="right" w:pos="10432"/>
-        </w:tabs>
-        <w:spacing w:before="70"/>
-      </w:pPr>
-      <w:r>
-        <w:rPr>
-          <w:rFonts w:ascii="Arial" w:cs="Arial" w:eastAsia="Arial" w:hAnsi="Arial"/>
-          <w:b/>
-          <w:bCs/>
-          <w:sz w:val="20"/>
-          <w:szCs w:val="20"/>
-        </w:rPr>
-        <w:t xml:space="preserve">Publication or Report Title</w:t>
-      </w:r>
-      <w:r>
-        <w:rPr>
-          <w:rFonts w:ascii="Arial" w:cs="Arial" w:eastAsia="Arial" w:hAnsi="Arial"/>
-          <w:sz w:val="19"/>
-          <w:szCs w:val="19"/>
-        </w:rPr>
-        <w:t xml:space="preserve">	</w:t>
-      </w:r>
-      <w:hyperlink w:history="1" r:id="rIdv1jkqhuoxxwj3ljcl7gwe">
+      <w:hyperlink w:history="1" r:id="rIdtnxaylw42kwzp8yrohoxo">
         <w:r>
           <w:rPr>
             <w:rStyle w:val="Hyperlink"/>
@@ -1153,7 +948,7 @@
         </w:rPr>
         <w:t xml:space="preserve"> | </w:t>
       </w:r>
-      <w:hyperlink w:history="1" r:id="rIdpskdtapibzsoveh67ny9u">
+      <w:hyperlink w:history="1" r:id="rIdtr79hj0icqihf3n4mjrfz">
         <w:r>
           <w:rPr>
             <w:rStyle w:val="Hyperlink"/>
@@ -1227,7 +1022,7 @@
           <w:sz w:val="23"/>
           <w:szCs w:val="23"/>
         </w:rPr>
-        <w:t xml:space="preserve">Leadership and Volunteering</w:t>
+        <w:t xml:space="preserve">Experience</w:t>
       </w:r>
     </w:p>
     <w:p>
@@ -1246,7 +1041,7 @@
           <w:sz w:val="20"/>
           <w:szCs w:val="20"/>
         </w:rPr>
-        <w:t xml:space="preserve">Society or Volunteer Role</w:t>
+        <w:t xml:space="preserve">Job Title</w:t>
       </w:r>
       <w:r>
         <w:rPr>
@@ -1259,10 +1054,14 @@
       <w:r>
         <w:rPr>
           <w:rFonts w:ascii="Arial" w:cs="Arial" w:eastAsia="Arial" w:hAnsi="Arial"/>
-          <w:sz w:val="19"/>
-          <w:szCs w:val="19"/>
-        </w:rPr>
-        <w:t xml:space="preserve">Month Year - Present</w:t>
+          <w:b/>
+          <w:bCs/>
+          <w:i/>
+          <w:iCs/>
+          <w:sz w:val="19"/>
+          <w:szCs w:val="19"/>
+        </w:rPr>
+        <w:t xml:space="preserve">Organisation Name, City</w:t>
       </w:r>
     </w:p>
     <w:p>
@@ -1280,17 +1079,17 @@
           <w:sz w:val="19"/>
           <w:szCs w:val="19"/>
         </w:rPr>
-        <w:t xml:space="preserve">Organisation Name</w:t>
-      </w:r>
-      <w:r>
-        <w:rPr>
-          <w:rFonts w:ascii="Arial" w:cs="Arial" w:eastAsia="Arial" w:hAnsi="Arial"/>
-          <w:i/>
-          <w:iCs/>
-          <w:sz w:val="19"/>
-          <w:szCs w:val="19"/>
-        </w:rPr>
-        <w:t xml:space="preserve">	</w:t>
+        <w:t xml:space="preserve">Three skills this role used</w:t>
+      </w:r>
+      <w:r>
+        <w:rPr>
+          <w:rFonts w:ascii="Arial" w:cs="Arial" w:eastAsia="Arial" w:hAnsi="Arial"/>
+          <w:i/>
+          <w:iCs/>
+          <w:sz w:val="19"/>
+          <w:szCs w:val="19"/>
+        </w:rPr>
+        <w:t xml:space="preserve">	Month Year - Present</w:t>
       </w:r>
     </w:p>
     <w:p>
@@ -1307,27 +1106,7 @@
           <w:sz w:val="19"/>
           <w:szCs w:val="19"/>
         </w:rPr>
-        <w:t xml:space="preserve">What you lead or do and who it helps, with a number where you have one</w:t>
-      </w:r>
-    </w:p>
-    <w:p>
-      <w:pPr>
-        <w:keepNext/>
-        <w:pBdr>
-          <w:bottom w:val="single" w:color="111111" w:sz="6" w:space="1"/>
-        </w:pBdr>
-        <w:spacing w:after="50" w:before="150"/>
-      </w:pPr>
-      <w:r>
-        <w:rPr>
-          <w:rFonts w:ascii="Arial" w:cs="Arial" w:eastAsia="Arial" w:hAnsi="Arial"/>
-          <w:b/>
-          <w:bCs/>
-          <w:smallCaps/>
-          <w:sz w:val="23"/>
-          <w:szCs w:val="23"/>
-        </w:rPr>
-        <w:t xml:space="preserve">Achievements</w:t>
+        <w:t xml:space="preserve">Your main responsibility, starting with a verb</w:t>
       </w:r>
     </w:p>
     <w:p>
@@ -1341,20 +1120,77 @@
       <w:r>
         <w:rPr>
           <w:rFonts w:ascii="Arial" w:cs="Arial" w:eastAsia="Arial" w:hAnsi="Arial"/>
-          <w:b/>
-          <w:bCs/>
-          <w:sz w:val="19"/>
-          <w:szCs w:val="19"/>
-        </w:rPr>
-        <w:t xml:space="preserve">Award or achievement</w:t>
-      </w:r>
-      <w:r>
-        <w:rPr>
-          <w:rFonts w:ascii="Arial" w:cs="Arial" w:eastAsia="Arial" w:hAnsi="Arial"/>
-          <w:sz w:val="19"/>
-          <w:szCs w:val="19"/>
-        </w:rPr>
-        <w:t xml:space="preserve">, organisation and year</w:t>
+          <w:sz w:val="19"/>
+          <w:szCs w:val="19"/>
+        </w:rPr>
+        <w:t xml:space="preserve">Something you improved or were trusted with</w:t>
+      </w:r>
+    </w:p>
+    <w:p>
+      <w:pPr>
+        <w:keepNext/>
+        <w:tabs>
+          <w:tab w:val="right" w:pos="10432"/>
+        </w:tabs>
+        <w:spacing w:before="70"/>
+      </w:pPr>
+      <w:r>
+        <w:rPr>
+          <w:rFonts w:ascii="Arial" w:cs="Arial" w:eastAsia="Arial" w:hAnsi="Arial"/>
+          <w:b/>
+          <w:bCs/>
+          <w:sz w:val="20"/>
+          <w:szCs w:val="20"/>
+        </w:rPr>
+        <w:t xml:space="preserve">Job Title (part-time)</w:t>
+      </w:r>
+      <w:r>
+        <w:rPr>
+          <w:rFonts w:ascii="Arial" w:cs="Arial" w:eastAsia="Arial" w:hAnsi="Arial"/>
+          <w:sz w:val="19"/>
+          <w:szCs w:val="19"/>
+        </w:rPr>
+        <w:t xml:space="preserve">	</w:t>
+      </w:r>
+      <w:r>
+        <w:rPr>
+          <w:rFonts w:ascii="Arial" w:cs="Arial" w:eastAsia="Arial" w:hAnsi="Arial"/>
+          <w:b/>
+          <w:bCs/>
+          <w:i/>
+          <w:iCs/>
+          <w:sz w:val="19"/>
+          <w:szCs w:val="19"/>
+        </w:rPr>
+        <w:t xml:space="preserve">Organisation Name, City</w:t>
+      </w:r>
+    </w:p>
+    <w:p>
+      <w:pPr>
+        <w:keepNext/>
+        <w:tabs>
+          <w:tab w:val="right" w:pos="10432"/>
+        </w:tabs>
+      </w:pPr>
+      <w:r>
+        <w:rPr>
+          <w:rFonts w:ascii="Arial" w:cs="Arial" w:eastAsia="Arial" w:hAnsi="Arial"/>
+          <w:i/>
+          <w:iCs/>
+          <w:sz w:val="19"/>
+          <w:szCs w:val="19"/>
+        </w:rPr>
+        <w:t xml:space="preserve">Three skills this role used</w:t>
+      </w:r>
+      <w:r>
+        <w:rPr>
+          <w:rFonts w:ascii="Arial" w:cs="Arial" w:eastAsia="Arial" w:hAnsi="Arial"/>
+          <w:i/>
+          <w:iCs/>
+          <w:sz w:val="19"/>
+          <w:szCs w:val="19"/>
+        </w:rPr>
+        <w:t xml:space="preserve">	Month Year - Month Year</w:t>
       </w:r>
     </w:p>
     <w:p>
@@ -1368,6 +1204,164 @@
       <w:r>
         <w:rPr>
           <w:rFonts w:ascii="Arial" w:cs="Arial" w:eastAsia="Arial" w:hAnsi="Arial"/>
+          <w:sz w:val="19"/>
+          <w:szCs w:val="19"/>
+        </w:rPr>
+        <w:t xml:space="preserve">Your main responsibility, starting with a verb</w:t>
+      </w:r>
+    </w:p>
+    <w:p>
+      <w:pPr>
+        <w:keepNext/>
+        <w:pBdr>
+          <w:bottom w:val="single" w:color="111111" w:sz="6" w:space="1"/>
+        </w:pBdr>
+        <w:spacing w:after="50" w:before="150"/>
+      </w:pPr>
+      <w:r>
+        <w:rPr>
+          <w:rFonts w:ascii="Arial" w:cs="Arial" w:eastAsia="Arial" w:hAnsi="Arial"/>
+          <w:b/>
+          <w:bCs/>
+          <w:smallCaps/>
+          <w:sz w:val="23"/>
+          <w:szCs w:val="23"/>
+        </w:rPr>
+        <w:t xml:space="preserve">Leadership and Volunteering</w:t>
+      </w:r>
+    </w:p>
+    <w:p>
+      <w:pPr>
+        <w:keepNext/>
+        <w:tabs>
+          <w:tab w:val="right" w:pos="10432"/>
+        </w:tabs>
+        <w:spacing w:before="70"/>
+      </w:pPr>
+      <w:r>
+        <w:rPr>
+          <w:rFonts w:ascii="Arial" w:cs="Arial" w:eastAsia="Arial" w:hAnsi="Arial"/>
+          <w:b/>
+          <w:bCs/>
+          <w:sz w:val="20"/>
+          <w:szCs w:val="20"/>
+        </w:rPr>
+        <w:t xml:space="preserve">Society or Volunteer Role</w:t>
+      </w:r>
+      <w:r>
+        <w:rPr>
+          <w:rFonts w:ascii="Arial" w:cs="Arial" w:eastAsia="Arial" w:hAnsi="Arial"/>
+          <w:sz w:val="19"/>
+          <w:szCs w:val="19"/>
+        </w:rPr>
+        <w:t xml:space="preserve">	</w:t>
+      </w:r>
+      <w:r>
+        <w:rPr>
+          <w:rFonts w:ascii="Arial" w:cs="Arial" w:eastAsia="Arial" w:hAnsi="Arial"/>
+          <w:b/>
+          <w:bCs/>
+          <w:i/>
+          <w:iCs/>
+          <w:sz w:val="19"/>
+          <w:szCs w:val="19"/>
+        </w:rPr>
+        <w:t xml:space="preserve">Organisation Name</w:t>
+      </w:r>
+    </w:p>
+    <w:p>
+      <w:pPr>
+        <w:keepNext/>
+        <w:tabs>
+          <w:tab w:val="right" w:pos="10432"/>
+        </w:tabs>
+      </w:pPr>
+      <w:r>
+        <w:rPr>
+          <w:rFonts w:ascii="Arial" w:cs="Arial" w:eastAsia="Arial" w:hAnsi="Arial"/>
+          <w:i/>
+          <w:iCs/>
+          <w:sz w:val="19"/>
+          <w:szCs w:val="19"/>
+        </w:rPr>
+        <w:t xml:space="preserve">	Month Year - Present</w:t>
+      </w:r>
+    </w:p>
+    <w:p>
+      <w:pPr>
+        <w:pStyle w:val="ListParagraph"/>
+        <w:numPr>
+          <w:ilvl w:val="0"/>
+          <w:numId w:val="2"/>
+        </w:numPr>
+      </w:pPr>
+      <w:r>
+        <w:rPr>
+          <w:rFonts w:ascii="Arial" w:cs="Arial" w:eastAsia="Arial" w:hAnsi="Arial"/>
+          <w:sz w:val="19"/>
+          <w:szCs w:val="19"/>
+        </w:rPr>
+        <w:t xml:space="preserve">What you lead or do and who it helps, with a number where you have one</w:t>
+      </w:r>
+    </w:p>
+    <w:p>
+      <w:pPr>
+        <w:keepNext/>
+        <w:pBdr>
+          <w:bottom w:val="single" w:color="111111" w:sz="6" w:space="1"/>
+        </w:pBdr>
+        <w:spacing w:after="50" w:before="150"/>
+      </w:pPr>
+      <w:r>
+        <w:rPr>
+          <w:rFonts w:ascii="Arial" w:cs="Arial" w:eastAsia="Arial" w:hAnsi="Arial"/>
+          <w:b/>
+          <w:bCs/>
+          <w:smallCaps/>
+          <w:sz w:val="23"/>
+          <w:szCs w:val="23"/>
+        </w:rPr>
+        <w:t xml:space="preserve">Achievements</w:t>
+      </w:r>
+    </w:p>
+    <w:p>
+      <w:pPr>
+        <w:pStyle w:val="ListParagraph"/>
+        <w:numPr>
+          <w:ilvl w:val="0"/>
+          <w:numId w:val="2"/>
+        </w:numPr>
+      </w:pPr>
+      <w:r>
+        <w:rPr>
+          <w:rFonts w:ascii="Arial" w:cs="Arial" w:eastAsia="Arial" w:hAnsi="Arial"/>
+          <w:b/>
+          <w:bCs/>
+          <w:sz w:val="19"/>
+          <w:szCs w:val="19"/>
+        </w:rPr>
+        <w:t xml:space="preserve">Award or achievement</w:t>
+      </w:r>
+      <w:r>
+        <w:rPr>
+          <w:rFonts w:ascii="Arial" w:cs="Arial" w:eastAsia="Arial" w:hAnsi="Arial"/>
+          <w:sz w:val="19"/>
+          <w:szCs w:val="19"/>
+        </w:rPr>
+        <w:t xml:space="preserve">, organisation and year</w:t>
+      </w:r>
+    </w:p>
+    <w:p>
+      <w:pPr>
+        <w:pStyle w:val="ListParagraph"/>
+        <w:numPr>
+          <w:ilvl w:val="0"/>
+          <w:numId w:val="2"/>
+        </w:numPr>
+      </w:pPr>
+      <w:r>
+        <w:rPr>
+          <w:rFonts w:ascii="Arial" w:cs="Arial" w:eastAsia="Arial" w:hAnsi="Arial"/>
           <w:b/>
           <w:bCs/>
           <w:sz w:val="19"/>
@@ -1391,7 +1385,7 @@
         </w:rPr>
         <w:t xml:space="preserve">: </w:t>
       </w:r>
-      <w:hyperlink w:history="1" r:id="rIdo4zt--xo-tgs6q9e_ig-j">
+      <w:hyperlink w:history="1" r:id="rIdyv0t5oy-0kgwcrslu-il5">
         <w:r>
           <w:rPr>
             <w:rStyle w:val="Hyperlink"/>

</xml_diff>

<commit_message>
feat: add a profile line, a Professional row and the new section order
Closes #20
</commit_message>
<xml_diff>
--- a/cv/cv.docx
+++ b/cv/cv.docx
@@ -32,7 +32,7 @@
         </w:rPr>
         <w:t xml:space="preserve">  |  </w:t>
       </w:r>
-      <w:hyperlink w:history="1" r:id="rIdwqkrfh6qamizazbizrorn">
+      <w:hyperlink w:history="1" r:id="rIdkjjz1ouxn7mtrn269eafo">
         <w:r>
           <w:rPr>
             <w:rStyle w:val="Hyperlink"/>
@@ -51,7 +51,7 @@
         </w:rPr>
         <w:t xml:space="preserve">  |  </w:t>
       </w:r>
-      <w:hyperlink w:history="1" r:id="rIdsfbal76tvtsgjjknl6a3l">
+      <w:hyperlink w:history="1" r:id="rId1cz7cn59xrxcrocdlo0n-">
         <w:r>
           <w:rPr>
             <w:rStyle w:val="Hyperlink"/>
@@ -67,7 +67,7 @@
       <w:pPr>
         <w:spacing w:after="60"/>
       </w:pPr>
-      <w:hyperlink w:history="1" r:id="rId_khs0qr_r7ri4wdhmjkm4">
+      <w:hyperlink w:history="1" r:id="rIdzt-e7ssdzpo3xb1kbljcd">
         <w:r>
           <w:rPr>
             <w:rStyle w:val="Hyperlink"/>
@@ -86,7 +86,7 @@
         </w:rPr>
         <w:t xml:space="preserve">  |  </w:t>
       </w:r>
-      <w:hyperlink w:history="1" r:id="rIdtp_9e_7ul2aml8bo28xhb">
+      <w:hyperlink w:history="1" r:id="rIdbrt0hggyvpmh6khu9peu3">
         <w:r>
           <w:rPr>
             <w:rStyle w:val="Hyperlink"/>
@@ -105,7 +105,7 @@
         </w:rPr>
         <w:t xml:space="preserve">  |  </w:t>
       </w:r>
-      <w:hyperlink w:history="1" r:id="rIdlq8y7bxrtgrs4j-grq8x4">
+      <w:hyperlink w:history="1" r:id="rIdgschmv9mllcfi7iljv0f0">
         <w:r>
           <w:rPr>
             <w:rStyle w:val="Hyperlink"/>
@@ -134,6 +134,36 @@
           <w:sz w:val="23"/>
           <w:szCs w:val="23"/>
         </w:rPr>
+        <w:t xml:space="preserve">Profile</w:t>
+      </w:r>
+    </w:p>
+    <w:p>
+      <w:r>
+        <w:rPr>
+          <w:rFonts w:ascii="Arial" w:cs="Arial" w:eastAsia="Arial" w:hAnsi="Arial"/>
+          <w:sz w:val="19"/>
+          <w:szCs w:val="19"/>
+        </w:rPr>
+        <w:t xml:space="preserve">One line on what drives your work and the role, placement or internship you want, with when you can start.</w:t>
+      </w:r>
+    </w:p>
+    <w:p>
+      <w:pPr>
+        <w:keepNext/>
+        <w:pBdr>
+          <w:bottom w:val="single" w:color="111111" w:sz="6" w:space="1"/>
+        </w:pBdr>
+        <w:spacing w:after="50" w:before="150"/>
+      </w:pPr>
+      <w:r>
+        <w:rPr>
+          <w:rFonts w:ascii="Arial" w:cs="Arial" w:eastAsia="Arial" w:hAnsi="Arial"/>
+          <w:b/>
+          <w:bCs/>
+          <w:smallCaps/>
+          <w:sz w:val="23"/>
+          <w:szCs w:val="23"/>
+        </w:rPr>
         <w:t xml:space="preserve">Education</w:t>
       </w:r>
     </w:p>
@@ -476,15 +506,15 @@
           <w:sz w:val="19"/>
           <w:szCs w:val="19"/>
         </w:rPr>
-        <w:t xml:space="preserve">Other skills: </w:t>
-      </w:r>
-      <w:r>
-        <w:rPr>
-          <w:rFonts w:ascii="Arial" w:cs="Arial" w:eastAsia="Arial" w:hAnsi="Arial"/>
-          <w:sz w:val="19"/>
-          <w:szCs w:val="19"/>
-        </w:rPr>
-        <w:t xml:space="preserve">Skill one, skill two, skill three</w:t>
+        <w:t xml:space="preserve">Professional: </w:t>
+      </w:r>
+      <w:r>
+        <w:rPr>
+          <w:rFonts w:ascii="Arial" w:cs="Arial" w:eastAsia="Arial" w:hAnsi="Arial"/>
+          <w:sz w:val="19"/>
+          <w:szCs w:val="19"/>
+        </w:rPr>
+        <w:t xml:space="preserve">Ways of working you can back up, such as Agile sprints, code review or technical writing</w:t>
       </w:r>
     </w:p>
     <w:p>
@@ -533,7 +563,7 @@
         </w:rPr>
         <w:t xml:space="preserve">	</w:t>
       </w:r>
-      <w:hyperlink w:history="1" r:id="rIdvngkahydhlabbcmqwb9dr">
+      <w:hyperlink w:history="1" r:id="rIdkkuciev6iuusffugpo8xf">
         <w:r>
           <w:rPr>
             <w:rStyle w:val="Hyperlink"/>
@@ -552,7 +582,7 @@
         </w:rPr>
         <w:t xml:space="preserve"> | </w:t>
       </w:r>
-      <w:hyperlink w:history="1" r:id="rIdxdvbgrfccmmqhdkrhv_kt">
+      <w:hyperlink w:history="1" r:id="rIdcycvg-94a46b1o4r66iip">
         <w:r>
           <w:rPr>
             <w:rStyle w:val="Hyperlink"/>
@@ -571,7 +601,7 @@
         </w:rPr>
         <w:t xml:space="preserve"> | </w:t>
       </w:r>
-      <w:hyperlink w:history="1" r:id="rIdrxpuncsffn8u7prae6yvv">
+      <w:hyperlink w:history="1" r:id="rIdhl4mhdj2oiofymsyfce5h">
         <w:r>
           <w:rPr>
             <w:rStyle w:val="Hyperlink"/>
@@ -689,7 +719,7 @@
         </w:rPr>
         <w:t xml:space="preserve">	</w:t>
       </w:r>
-      <w:hyperlink w:history="1" r:id="rId3y-k0hk1u6jz8m3hlnk8o">
+      <w:hyperlink w:history="1" r:id="rIdddmisar9th1kibfnkdfc3">
         <w:r>
           <w:rPr>
             <w:rStyle w:val="Hyperlink"/>
@@ -708,7 +738,7 @@
         </w:rPr>
         <w:t xml:space="preserve"> | </w:t>
       </w:r>
-      <w:hyperlink w:history="1" r:id="rIdyevmyvghvxac_ctiwwcve">
+      <w:hyperlink w:history="1" r:id="rIdmh-plxilwnzrt2ovumk5p">
         <w:r>
           <w:rPr>
             <w:rStyle w:val="Hyperlink"/>
@@ -826,7 +856,7 @@
         </w:rPr>
         <w:t xml:space="preserve">	</w:t>
       </w:r>
-      <w:hyperlink w:history="1" r:id="rId3ndgwbpavwehafzhf9qwn">
+      <w:hyperlink w:history="1" r:id="rIdypapdp7_92cjkeedreo_b">
         <w:r>
           <w:rPr>
             <w:rStyle w:val="Hyperlink"/>
@@ -900,7 +930,7 @@
           <w:sz w:val="23"/>
           <w:szCs w:val="23"/>
         </w:rPr>
-        <w:t xml:space="preserve">Research and Publications</w:t>
+        <w:t xml:space="preserve">Experience</w:t>
       </w:r>
     </w:p>
     <w:p>
@@ -919,6 +949,221 @@
           <w:sz w:val="20"/>
           <w:szCs w:val="20"/>
         </w:rPr>
+        <w:t xml:space="preserve">Job Title</w:t>
+      </w:r>
+      <w:r>
+        <w:rPr>
+          <w:rFonts w:ascii="Arial" w:cs="Arial" w:eastAsia="Arial" w:hAnsi="Arial"/>
+          <w:sz w:val="19"/>
+          <w:szCs w:val="19"/>
+        </w:rPr>
+        <w:t xml:space="preserve">	</w:t>
+      </w:r>
+      <w:r>
+        <w:rPr>
+          <w:rFonts w:ascii="Arial" w:cs="Arial" w:eastAsia="Arial" w:hAnsi="Arial"/>
+          <w:b/>
+          <w:bCs/>
+          <w:i/>
+          <w:iCs/>
+          <w:sz w:val="19"/>
+          <w:szCs w:val="19"/>
+        </w:rPr>
+        <w:t xml:space="preserve">Organisation Name, City</w:t>
+      </w:r>
+    </w:p>
+    <w:p>
+      <w:pPr>
+        <w:keepNext/>
+        <w:tabs>
+          <w:tab w:val="right" w:pos="10432"/>
+        </w:tabs>
+      </w:pPr>
+      <w:r>
+        <w:rPr>
+          <w:rFonts w:ascii="Arial" w:cs="Arial" w:eastAsia="Arial" w:hAnsi="Arial"/>
+          <w:i/>
+          <w:iCs/>
+          <w:sz w:val="19"/>
+          <w:szCs w:val="19"/>
+        </w:rPr>
+        <w:t xml:space="preserve">Three skills this role used</w:t>
+      </w:r>
+      <w:r>
+        <w:rPr>
+          <w:rFonts w:ascii="Arial" w:cs="Arial" w:eastAsia="Arial" w:hAnsi="Arial"/>
+          <w:i/>
+          <w:iCs/>
+          <w:sz w:val="19"/>
+          <w:szCs w:val="19"/>
+        </w:rPr>
+        <w:t xml:space="preserve">	Month Year - Present</w:t>
+      </w:r>
+    </w:p>
+    <w:p>
+      <w:pPr>
+        <w:pStyle w:val="ListParagraph"/>
+        <w:numPr>
+          <w:ilvl w:val="0"/>
+          <w:numId w:val="2"/>
+        </w:numPr>
+      </w:pPr>
+      <w:r>
+        <w:rPr>
+          <w:rFonts w:ascii="Arial" w:cs="Arial" w:eastAsia="Arial" w:hAnsi="Arial"/>
+          <w:sz w:val="19"/>
+          <w:szCs w:val="19"/>
+        </w:rPr>
+        <w:t xml:space="preserve">Your main responsibility, starting with a verb</w:t>
+      </w:r>
+    </w:p>
+    <w:p>
+      <w:pPr>
+        <w:pStyle w:val="ListParagraph"/>
+        <w:numPr>
+          <w:ilvl w:val="0"/>
+          <w:numId w:val="2"/>
+        </w:numPr>
+      </w:pPr>
+      <w:r>
+        <w:rPr>
+          <w:rFonts w:ascii="Arial" w:cs="Arial" w:eastAsia="Arial" w:hAnsi="Arial"/>
+          <w:sz w:val="19"/>
+          <w:szCs w:val="19"/>
+        </w:rPr>
+        <w:t xml:space="preserve">Something you improved or were trusted with</w:t>
+      </w:r>
+    </w:p>
+    <w:p>
+      <w:pPr>
+        <w:keepNext/>
+        <w:pBdr>
+          <w:bottom w:val="single" w:color="111111" w:sz="6" w:space="1"/>
+        </w:pBdr>
+        <w:spacing w:after="50" w:before="150"/>
+      </w:pPr>
+      <w:r>
+        <w:rPr>
+          <w:rFonts w:ascii="Arial" w:cs="Arial" w:eastAsia="Arial" w:hAnsi="Arial"/>
+          <w:b/>
+          <w:bCs/>
+          <w:smallCaps/>
+          <w:sz w:val="23"/>
+          <w:szCs w:val="23"/>
+        </w:rPr>
+        <w:t xml:space="preserve">Leadership and Volunteering</w:t>
+      </w:r>
+    </w:p>
+    <w:p>
+      <w:pPr>
+        <w:keepNext/>
+        <w:tabs>
+          <w:tab w:val="right" w:pos="10432"/>
+        </w:tabs>
+        <w:spacing w:before="70"/>
+      </w:pPr>
+      <w:r>
+        <w:rPr>
+          <w:rFonts w:ascii="Arial" w:cs="Arial" w:eastAsia="Arial" w:hAnsi="Arial"/>
+          <w:b/>
+          <w:bCs/>
+          <w:sz w:val="20"/>
+          <w:szCs w:val="20"/>
+        </w:rPr>
+        <w:t xml:space="preserve">Society or Volunteer Role</w:t>
+      </w:r>
+      <w:r>
+        <w:rPr>
+          <w:rFonts w:ascii="Arial" w:cs="Arial" w:eastAsia="Arial" w:hAnsi="Arial"/>
+          <w:sz w:val="19"/>
+          <w:szCs w:val="19"/>
+        </w:rPr>
+        <w:t xml:space="preserve">	</w:t>
+      </w:r>
+      <w:r>
+        <w:rPr>
+          <w:rFonts w:ascii="Arial" w:cs="Arial" w:eastAsia="Arial" w:hAnsi="Arial"/>
+          <w:b/>
+          <w:bCs/>
+          <w:i/>
+          <w:iCs/>
+          <w:sz w:val="19"/>
+          <w:szCs w:val="19"/>
+        </w:rPr>
+        <w:t xml:space="preserve">Organisation Name</w:t>
+      </w:r>
+    </w:p>
+    <w:p>
+      <w:pPr>
+        <w:keepNext/>
+        <w:tabs>
+          <w:tab w:val="right" w:pos="10432"/>
+        </w:tabs>
+      </w:pPr>
+      <w:r>
+        <w:rPr>
+          <w:rFonts w:ascii="Arial" w:cs="Arial" w:eastAsia="Arial" w:hAnsi="Arial"/>
+          <w:i/>
+          <w:iCs/>
+          <w:sz w:val="19"/>
+          <w:szCs w:val="19"/>
+        </w:rPr>
+        <w:t xml:space="preserve">	Month Year - Present</w:t>
+      </w:r>
+    </w:p>
+    <w:p>
+      <w:pPr>
+        <w:pStyle w:val="ListParagraph"/>
+        <w:numPr>
+          <w:ilvl w:val="0"/>
+          <w:numId w:val="2"/>
+        </w:numPr>
+      </w:pPr>
+      <w:r>
+        <w:rPr>
+          <w:rFonts w:ascii="Arial" w:cs="Arial" w:eastAsia="Arial" w:hAnsi="Arial"/>
+          <w:sz w:val="19"/>
+          <w:szCs w:val="19"/>
+        </w:rPr>
+        <w:t xml:space="preserve">What you lead or do and who it helps, with a number where you have one</w:t>
+      </w:r>
+    </w:p>
+    <w:p>
+      <w:pPr>
+        <w:keepNext/>
+        <w:pBdr>
+          <w:bottom w:val="single" w:color="111111" w:sz="6" w:space="1"/>
+        </w:pBdr>
+        <w:spacing w:after="50" w:before="150"/>
+      </w:pPr>
+      <w:r>
+        <w:rPr>
+          <w:rFonts w:ascii="Arial" w:cs="Arial" w:eastAsia="Arial" w:hAnsi="Arial"/>
+          <w:b/>
+          <w:bCs/>
+          <w:smallCaps/>
+          <w:sz w:val="23"/>
+          <w:szCs w:val="23"/>
+        </w:rPr>
+        <w:t xml:space="preserve">Research and Publications</w:t>
+      </w:r>
+    </w:p>
+    <w:p>
+      <w:pPr>
+        <w:keepNext/>
+        <w:tabs>
+          <w:tab w:val="right" w:pos="10432"/>
+        </w:tabs>
+        <w:spacing w:before="70"/>
+      </w:pPr>
+      <w:r>
+        <w:rPr>
+          <w:rFonts w:ascii="Arial" w:cs="Arial" w:eastAsia="Arial" w:hAnsi="Arial"/>
+          <w:b/>
+          <w:bCs/>
+          <w:sz w:val="20"/>
+          <w:szCs w:val="20"/>
+        </w:rPr>
         <w:t xml:space="preserve">Publication or Report Title</w:t>
       </w:r>
       <w:r>
@@ -929,7 +1174,7 @@
         </w:rPr>
         <w:t xml:space="preserve">	</w:t>
       </w:r>
-      <w:hyperlink w:history="1" r:id="rIdtnxaylw42kwzp8yrohoxo">
+      <w:hyperlink w:history="1" r:id="rIdo-ki4q-16ktlbslqtfdpa">
         <w:r>
           <w:rPr>
             <w:rStyle w:val="Hyperlink"/>
@@ -948,7 +1193,7 @@
         </w:rPr>
         <w:t xml:space="preserve"> | </w:t>
       </w:r>
-      <w:hyperlink w:history="1" r:id="rIdtr79hj0icqihf3n4mjrfz">
+      <w:hyperlink w:history="1" r:id="rId7fhj7owjtkmjpqrk7zczs">
         <w:r>
           <w:rPr>
             <w:rStyle w:val="Hyperlink"/>
@@ -1022,74 +1267,7 @@
           <w:sz w:val="23"/>
           <w:szCs w:val="23"/>
         </w:rPr>
-        <w:t xml:space="preserve">Experience</w:t>
-      </w:r>
-    </w:p>
-    <w:p>
-      <w:pPr>
-        <w:keepNext/>
-        <w:tabs>
-          <w:tab w:val="right" w:pos="10432"/>
-        </w:tabs>
-        <w:spacing w:before="70"/>
-      </w:pPr>
-      <w:r>
-        <w:rPr>
-          <w:rFonts w:ascii="Arial" w:cs="Arial" w:eastAsia="Arial" w:hAnsi="Arial"/>
-          <w:b/>
-          <w:bCs/>
-          <w:sz w:val="20"/>
-          <w:szCs w:val="20"/>
-        </w:rPr>
-        <w:t xml:space="preserve">Job Title</w:t>
-      </w:r>
-      <w:r>
-        <w:rPr>
-          <w:rFonts w:ascii="Arial" w:cs="Arial" w:eastAsia="Arial" w:hAnsi="Arial"/>
-          <w:sz w:val="19"/>
-          <w:szCs w:val="19"/>
-        </w:rPr>
-        <w:t xml:space="preserve">	</w:t>
-      </w:r>
-      <w:r>
-        <w:rPr>
-          <w:rFonts w:ascii="Arial" w:cs="Arial" w:eastAsia="Arial" w:hAnsi="Arial"/>
-          <w:b/>
-          <w:bCs/>
-          <w:i/>
-          <w:iCs/>
-          <w:sz w:val="19"/>
-          <w:szCs w:val="19"/>
-        </w:rPr>
-        <w:t xml:space="preserve">Organisation Name, City</w:t>
-      </w:r>
-    </w:p>
-    <w:p>
-      <w:pPr>
-        <w:keepNext/>
-        <w:tabs>
-          <w:tab w:val="right" w:pos="10432"/>
-        </w:tabs>
-      </w:pPr>
-      <w:r>
-        <w:rPr>
-          <w:rFonts w:ascii="Arial" w:cs="Arial" w:eastAsia="Arial" w:hAnsi="Arial"/>
-          <w:i/>
-          <w:iCs/>
-          <w:sz w:val="19"/>
-          <w:szCs w:val="19"/>
-        </w:rPr>
-        <w:t xml:space="preserve">Three skills this role used</w:t>
-      </w:r>
-      <w:r>
-        <w:rPr>
-          <w:rFonts w:ascii="Arial" w:cs="Arial" w:eastAsia="Arial" w:hAnsi="Arial"/>
-          <w:i/>
-          <w:iCs/>
-          <w:sz w:val="19"/>
-          <w:szCs w:val="19"/>
-        </w:rPr>
-        <w:t xml:space="preserve">	Month Year - Present</w:t>
+        <w:t xml:space="preserve">Achievements</w:t>
       </w:r>
     </w:p>
     <w:p>
@@ -1103,10 +1281,20 @@
       <w:r>
         <w:rPr>
           <w:rFonts w:ascii="Arial" w:cs="Arial" w:eastAsia="Arial" w:hAnsi="Arial"/>
-          <w:sz w:val="19"/>
-          <w:szCs w:val="19"/>
-        </w:rPr>
-        <w:t xml:space="preserve">Your main responsibility, starting with a verb</w:t>
+          <w:b/>
+          <w:bCs/>
+          <w:sz w:val="19"/>
+          <w:szCs w:val="19"/>
+        </w:rPr>
+        <w:t xml:space="preserve">Award or achievement</w:t>
+      </w:r>
+      <w:r>
+        <w:rPr>
+          <w:rFonts w:ascii="Arial" w:cs="Arial" w:eastAsia="Arial" w:hAnsi="Arial"/>
+          <w:sz w:val="19"/>
+          <w:szCs w:val="19"/>
+        </w:rPr>
+        <w:t xml:space="preserve">, organisation and year</w:t>
       </w:r>
     </w:p>
     <w:p>
@@ -1120,248 +1308,6 @@
       <w:r>
         <w:rPr>
           <w:rFonts w:ascii="Arial" w:cs="Arial" w:eastAsia="Arial" w:hAnsi="Arial"/>
-          <w:sz w:val="19"/>
-          <w:szCs w:val="19"/>
-        </w:rPr>
-        <w:t xml:space="preserve">Something you improved or were trusted with</w:t>
-      </w:r>
-    </w:p>
-    <w:p>
-      <w:pPr>
-        <w:keepNext/>
-        <w:tabs>
-          <w:tab w:val="right" w:pos="10432"/>
-        </w:tabs>
-        <w:spacing w:before="70"/>
-      </w:pPr>
-      <w:r>
-        <w:rPr>
-          <w:rFonts w:ascii="Arial" w:cs="Arial" w:eastAsia="Arial" w:hAnsi="Arial"/>
-          <w:b/>
-          <w:bCs/>
-          <w:sz w:val="20"/>
-          <w:szCs w:val="20"/>
-        </w:rPr>
-        <w:t xml:space="preserve">Job Title (part-time)</w:t>
-      </w:r>
-      <w:r>
-        <w:rPr>
-          <w:rFonts w:ascii="Arial" w:cs="Arial" w:eastAsia="Arial" w:hAnsi="Arial"/>
-          <w:sz w:val="19"/>
-          <w:szCs w:val="19"/>
-        </w:rPr>
-        <w:t xml:space="preserve">	</w:t>
-      </w:r>
-      <w:r>
-        <w:rPr>
-          <w:rFonts w:ascii="Arial" w:cs="Arial" w:eastAsia="Arial" w:hAnsi="Arial"/>
-          <w:b/>
-          <w:bCs/>
-          <w:i/>
-          <w:iCs/>
-          <w:sz w:val="19"/>
-          <w:szCs w:val="19"/>
-        </w:rPr>
-        <w:t xml:space="preserve">Organisation Name, City</w:t>
-      </w:r>
-    </w:p>
-    <w:p>
-      <w:pPr>
-        <w:keepNext/>
-        <w:tabs>
-          <w:tab w:val="right" w:pos="10432"/>
-        </w:tabs>
-      </w:pPr>
-      <w:r>
-        <w:rPr>
-          <w:rFonts w:ascii="Arial" w:cs="Arial" w:eastAsia="Arial" w:hAnsi="Arial"/>
-          <w:i/>
-          <w:iCs/>
-          <w:sz w:val="19"/>
-          <w:szCs w:val="19"/>
-        </w:rPr>
-        <w:t xml:space="preserve">Three skills this role used</w:t>
-      </w:r>
-      <w:r>
-        <w:rPr>
-          <w:rFonts w:ascii="Arial" w:cs="Arial" w:eastAsia="Arial" w:hAnsi="Arial"/>
-          <w:i/>
-          <w:iCs/>
-          <w:sz w:val="19"/>
-          <w:szCs w:val="19"/>
-        </w:rPr>
-        <w:t xml:space="preserve">	Month Year - Month Year</w:t>
-      </w:r>
-    </w:p>
-    <w:p>
-      <w:pPr>
-        <w:pStyle w:val="ListParagraph"/>
-        <w:numPr>
-          <w:ilvl w:val="0"/>
-          <w:numId w:val="2"/>
-        </w:numPr>
-      </w:pPr>
-      <w:r>
-        <w:rPr>
-          <w:rFonts w:ascii="Arial" w:cs="Arial" w:eastAsia="Arial" w:hAnsi="Arial"/>
-          <w:sz w:val="19"/>
-          <w:szCs w:val="19"/>
-        </w:rPr>
-        <w:t xml:space="preserve">Your main responsibility, starting with a verb</w:t>
-      </w:r>
-    </w:p>
-    <w:p>
-      <w:pPr>
-        <w:keepNext/>
-        <w:pBdr>
-          <w:bottom w:val="single" w:color="111111" w:sz="6" w:space="1"/>
-        </w:pBdr>
-        <w:spacing w:after="50" w:before="150"/>
-      </w:pPr>
-      <w:r>
-        <w:rPr>
-          <w:rFonts w:ascii="Arial" w:cs="Arial" w:eastAsia="Arial" w:hAnsi="Arial"/>
-          <w:b/>
-          <w:bCs/>
-          <w:smallCaps/>
-          <w:sz w:val="23"/>
-          <w:szCs w:val="23"/>
-        </w:rPr>
-        <w:t xml:space="preserve">Leadership and Volunteering</w:t>
-      </w:r>
-    </w:p>
-    <w:p>
-      <w:pPr>
-        <w:keepNext/>
-        <w:tabs>
-          <w:tab w:val="right" w:pos="10432"/>
-        </w:tabs>
-        <w:spacing w:before="70"/>
-      </w:pPr>
-      <w:r>
-        <w:rPr>
-          <w:rFonts w:ascii="Arial" w:cs="Arial" w:eastAsia="Arial" w:hAnsi="Arial"/>
-          <w:b/>
-          <w:bCs/>
-          <w:sz w:val="20"/>
-          <w:szCs w:val="20"/>
-        </w:rPr>
-        <w:t xml:space="preserve">Society or Volunteer Role</w:t>
-      </w:r>
-      <w:r>
-        <w:rPr>
-          <w:rFonts w:ascii="Arial" w:cs="Arial" w:eastAsia="Arial" w:hAnsi="Arial"/>
-          <w:sz w:val="19"/>
-          <w:szCs w:val="19"/>
-        </w:rPr>
-        <w:t xml:space="preserve">	</w:t>
-      </w:r>
-      <w:r>
-        <w:rPr>
-          <w:rFonts w:ascii="Arial" w:cs="Arial" w:eastAsia="Arial" w:hAnsi="Arial"/>
-          <w:b/>
-          <w:bCs/>
-          <w:i/>
-          <w:iCs/>
-          <w:sz w:val="19"/>
-          <w:szCs w:val="19"/>
-        </w:rPr>
-        <w:t xml:space="preserve">Organisation Name</w:t>
-      </w:r>
-    </w:p>
-    <w:p>
-      <w:pPr>
-        <w:keepNext/>
-        <w:tabs>
-          <w:tab w:val="right" w:pos="10432"/>
-        </w:tabs>
-      </w:pPr>
-      <w:r>
-        <w:rPr>
-          <w:rFonts w:ascii="Arial" w:cs="Arial" w:eastAsia="Arial" w:hAnsi="Arial"/>
-          <w:i/>
-          <w:iCs/>
-          <w:sz w:val="19"/>
-          <w:szCs w:val="19"/>
-        </w:rPr>
-        <w:t xml:space="preserve">	Month Year - Present</w:t>
-      </w:r>
-    </w:p>
-    <w:p>
-      <w:pPr>
-        <w:pStyle w:val="ListParagraph"/>
-        <w:numPr>
-          <w:ilvl w:val="0"/>
-          <w:numId w:val="2"/>
-        </w:numPr>
-      </w:pPr>
-      <w:r>
-        <w:rPr>
-          <w:rFonts w:ascii="Arial" w:cs="Arial" w:eastAsia="Arial" w:hAnsi="Arial"/>
-          <w:sz w:val="19"/>
-          <w:szCs w:val="19"/>
-        </w:rPr>
-        <w:t xml:space="preserve">What you lead or do and who it helps, with a number where you have one</w:t>
-      </w:r>
-    </w:p>
-    <w:p>
-      <w:pPr>
-        <w:keepNext/>
-        <w:pBdr>
-          <w:bottom w:val="single" w:color="111111" w:sz="6" w:space="1"/>
-        </w:pBdr>
-        <w:spacing w:after="50" w:before="150"/>
-      </w:pPr>
-      <w:r>
-        <w:rPr>
-          <w:rFonts w:ascii="Arial" w:cs="Arial" w:eastAsia="Arial" w:hAnsi="Arial"/>
-          <w:b/>
-          <w:bCs/>
-          <w:smallCaps/>
-          <w:sz w:val="23"/>
-          <w:szCs w:val="23"/>
-        </w:rPr>
-        <w:t xml:space="preserve">Achievements</w:t>
-      </w:r>
-    </w:p>
-    <w:p>
-      <w:pPr>
-        <w:pStyle w:val="ListParagraph"/>
-        <w:numPr>
-          <w:ilvl w:val="0"/>
-          <w:numId w:val="2"/>
-        </w:numPr>
-      </w:pPr>
-      <w:r>
-        <w:rPr>
-          <w:rFonts w:ascii="Arial" w:cs="Arial" w:eastAsia="Arial" w:hAnsi="Arial"/>
-          <w:b/>
-          <w:bCs/>
-          <w:sz w:val="19"/>
-          <w:szCs w:val="19"/>
-        </w:rPr>
-        <w:t xml:space="preserve">Award or achievement</w:t>
-      </w:r>
-      <w:r>
-        <w:rPr>
-          <w:rFonts w:ascii="Arial" w:cs="Arial" w:eastAsia="Arial" w:hAnsi="Arial"/>
-          <w:sz w:val="19"/>
-          <w:szCs w:val="19"/>
-        </w:rPr>
-        <w:t xml:space="preserve">, organisation and year</w:t>
-      </w:r>
-    </w:p>
-    <w:p>
-      <w:pPr>
-        <w:pStyle w:val="ListParagraph"/>
-        <w:numPr>
-          <w:ilvl w:val="0"/>
-          <w:numId w:val="2"/>
-        </w:numPr>
-      </w:pPr>
-      <w:r>
-        <w:rPr>
-          <w:rFonts w:ascii="Arial" w:cs="Arial" w:eastAsia="Arial" w:hAnsi="Arial"/>
           <w:b/>
           <w:bCs/>
           <w:sz w:val="19"/>
@@ -1385,7 +1331,7 @@
         </w:rPr>
         <w:t xml:space="preserve">: </w:t>
       </w:r>
-      <w:hyperlink w:history="1" r:id="rIdyv0t5oy-0kgwcrslu-il5">
+      <w:hyperlink w:history="1" r:id="rIdkbmgnu7ltqifmiee2ucml">
         <w:r>
           <w:rPr>
             <w:rStyle w:val="Hyperlink"/>

</xml_diff>

<commit_message>
feat: add a profile line, a Professional row and the new section order (#21)
Closes #20
</commit_message>
<xml_diff>
--- a/cv/cv.docx
+++ b/cv/cv.docx
@@ -32,7 +32,7 @@
         </w:rPr>
         <w:t xml:space="preserve">  |  </w:t>
       </w:r>
-      <w:hyperlink w:history="1" r:id="rIdwqkrfh6qamizazbizrorn">
+      <w:hyperlink w:history="1" r:id="rIdkjjz1ouxn7mtrn269eafo">
         <w:r>
           <w:rPr>
             <w:rStyle w:val="Hyperlink"/>
@@ -51,7 +51,7 @@
         </w:rPr>
         <w:t xml:space="preserve">  |  </w:t>
       </w:r>
-      <w:hyperlink w:history="1" r:id="rIdsfbal76tvtsgjjknl6a3l">
+      <w:hyperlink w:history="1" r:id="rId1cz7cn59xrxcrocdlo0n-">
         <w:r>
           <w:rPr>
             <w:rStyle w:val="Hyperlink"/>
@@ -67,7 +67,7 @@
       <w:pPr>
         <w:spacing w:after="60"/>
       </w:pPr>
-      <w:hyperlink w:history="1" r:id="rId_khs0qr_r7ri4wdhmjkm4">
+      <w:hyperlink w:history="1" r:id="rIdzt-e7ssdzpo3xb1kbljcd">
         <w:r>
           <w:rPr>
             <w:rStyle w:val="Hyperlink"/>
@@ -86,7 +86,7 @@
         </w:rPr>
         <w:t xml:space="preserve">  |  </w:t>
       </w:r>
-      <w:hyperlink w:history="1" r:id="rIdtp_9e_7ul2aml8bo28xhb">
+      <w:hyperlink w:history="1" r:id="rIdbrt0hggyvpmh6khu9peu3">
         <w:r>
           <w:rPr>
             <w:rStyle w:val="Hyperlink"/>
@@ -105,7 +105,7 @@
         </w:rPr>
         <w:t xml:space="preserve">  |  </w:t>
       </w:r>
-      <w:hyperlink w:history="1" r:id="rIdlq8y7bxrtgrs4j-grq8x4">
+      <w:hyperlink w:history="1" r:id="rIdgschmv9mllcfi7iljv0f0">
         <w:r>
           <w:rPr>
             <w:rStyle w:val="Hyperlink"/>
@@ -134,6 +134,36 @@
           <w:sz w:val="23"/>
           <w:szCs w:val="23"/>
         </w:rPr>
+        <w:t xml:space="preserve">Profile</w:t>
+      </w:r>
+    </w:p>
+    <w:p>
+      <w:r>
+        <w:rPr>
+          <w:rFonts w:ascii="Arial" w:cs="Arial" w:eastAsia="Arial" w:hAnsi="Arial"/>
+          <w:sz w:val="19"/>
+          <w:szCs w:val="19"/>
+        </w:rPr>
+        <w:t xml:space="preserve">One line on what drives your work and the role, placement or internship you want, with when you can start.</w:t>
+      </w:r>
+    </w:p>
+    <w:p>
+      <w:pPr>
+        <w:keepNext/>
+        <w:pBdr>
+          <w:bottom w:val="single" w:color="111111" w:sz="6" w:space="1"/>
+        </w:pBdr>
+        <w:spacing w:after="50" w:before="150"/>
+      </w:pPr>
+      <w:r>
+        <w:rPr>
+          <w:rFonts w:ascii="Arial" w:cs="Arial" w:eastAsia="Arial" w:hAnsi="Arial"/>
+          <w:b/>
+          <w:bCs/>
+          <w:smallCaps/>
+          <w:sz w:val="23"/>
+          <w:szCs w:val="23"/>
+        </w:rPr>
         <w:t xml:space="preserve">Education</w:t>
       </w:r>
     </w:p>
@@ -476,15 +506,15 @@
           <w:sz w:val="19"/>
           <w:szCs w:val="19"/>
         </w:rPr>
-        <w:t xml:space="preserve">Other skills: </w:t>
-      </w:r>
-      <w:r>
-        <w:rPr>
-          <w:rFonts w:ascii="Arial" w:cs="Arial" w:eastAsia="Arial" w:hAnsi="Arial"/>
-          <w:sz w:val="19"/>
-          <w:szCs w:val="19"/>
-        </w:rPr>
-        <w:t xml:space="preserve">Skill one, skill two, skill three</w:t>
+        <w:t xml:space="preserve">Professional: </w:t>
+      </w:r>
+      <w:r>
+        <w:rPr>
+          <w:rFonts w:ascii="Arial" w:cs="Arial" w:eastAsia="Arial" w:hAnsi="Arial"/>
+          <w:sz w:val="19"/>
+          <w:szCs w:val="19"/>
+        </w:rPr>
+        <w:t xml:space="preserve">Ways of working you can back up, such as Agile sprints, code review or technical writing</w:t>
       </w:r>
     </w:p>
     <w:p>
@@ -533,7 +563,7 @@
         </w:rPr>
         <w:t xml:space="preserve">	</w:t>
       </w:r>
-      <w:hyperlink w:history="1" r:id="rIdvngkahydhlabbcmqwb9dr">
+      <w:hyperlink w:history="1" r:id="rIdkkuciev6iuusffugpo8xf">
         <w:r>
           <w:rPr>
             <w:rStyle w:val="Hyperlink"/>
@@ -552,7 +582,7 @@
         </w:rPr>
         <w:t xml:space="preserve"> | </w:t>
       </w:r>
-      <w:hyperlink w:history="1" r:id="rIdxdvbgrfccmmqhdkrhv_kt">
+      <w:hyperlink w:history="1" r:id="rIdcycvg-94a46b1o4r66iip">
         <w:r>
           <w:rPr>
             <w:rStyle w:val="Hyperlink"/>
@@ -571,7 +601,7 @@
         </w:rPr>
         <w:t xml:space="preserve"> | </w:t>
       </w:r>
-      <w:hyperlink w:history="1" r:id="rIdrxpuncsffn8u7prae6yvv">
+      <w:hyperlink w:history="1" r:id="rIdhl4mhdj2oiofymsyfce5h">
         <w:r>
           <w:rPr>
             <w:rStyle w:val="Hyperlink"/>
@@ -689,7 +719,7 @@
         </w:rPr>
         <w:t xml:space="preserve">	</w:t>
       </w:r>
-      <w:hyperlink w:history="1" r:id="rId3y-k0hk1u6jz8m3hlnk8o">
+      <w:hyperlink w:history="1" r:id="rIdddmisar9th1kibfnkdfc3">
         <w:r>
           <w:rPr>
             <w:rStyle w:val="Hyperlink"/>
@@ -708,7 +738,7 @@
         </w:rPr>
         <w:t xml:space="preserve"> | </w:t>
       </w:r>
-      <w:hyperlink w:history="1" r:id="rIdyevmyvghvxac_ctiwwcve">
+      <w:hyperlink w:history="1" r:id="rIdmh-plxilwnzrt2ovumk5p">
         <w:r>
           <w:rPr>
             <w:rStyle w:val="Hyperlink"/>
@@ -826,7 +856,7 @@
         </w:rPr>
         <w:t xml:space="preserve">	</w:t>
       </w:r>
-      <w:hyperlink w:history="1" r:id="rId3ndgwbpavwehafzhf9qwn">
+      <w:hyperlink w:history="1" r:id="rIdypapdp7_92cjkeedreo_b">
         <w:r>
           <w:rPr>
             <w:rStyle w:val="Hyperlink"/>
@@ -900,7 +930,7 @@
           <w:sz w:val="23"/>
           <w:szCs w:val="23"/>
         </w:rPr>
-        <w:t xml:space="preserve">Research and Publications</w:t>
+        <w:t xml:space="preserve">Experience</w:t>
       </w:r>
     </w:p>
     <w:p>
@@ -919,6 +949,221 @@
           <w:sz w:val="20"/>
           <w:szCs w:val="20"/>
         </w:rPr>
+        <w:t xml:space="preserve">Job Title</w:t>
+      </w:r>
+      <w:r>
+        <w:rPr>
+          <w:rFonts w:ascii="Arial" w:cs="Arial" w:eastAsia="Arial" w:hAnsi="Arial"/>
+          <w:sz w:val="19"/>
+          <w:szCs w:val="19"/>
+        </w:rPr>
+        <w:t xml:space="preserve">	</w:t>
+      </w:r>
+      <w:r>
+        <w:rPr>
+          <w:rFonts w:ascii="Arial" w:cs="Arial" w:eastAsia="Arial" w:hAnsi="Arial"/>
+          <w:b/>
+          <w:bCs/>
+          <w:i/>
+          <w:iCs/>
+          <w:sz w:val="19"/>
+          <w:szCs w:val="19"/>
+        </w:rPr>
+        <w:t xml:space="preserve">Organisation Name, City</w:t>
+      </w:r>
+    </w:p>
+    <w:p>
+      <w:pPr>
+        <w:keepNext/>
+        <w:tabs>
+          <w:tab w:val="right" w:pos="10432"/>
+        </w:tabs>
+      </w:pPr>
+      <w:r>
+        <w:rPr>
+          <w:rFonts w:ascii="Arial" w:cs="Arial" w:eastAsia="Arial" w:hAnsi="Arial"/>
+          <w:i/>
+          <w:iCs/>
+          <w:sz w:val="19"/>
+          <w:szCs w:val="19"/>
+        </w:rPr>
+        <w:t xml:space="preserve">Three skills this role used</w:t>
+      </w:r>
+      <w:r>
+        <w:rPr>
+          <w:rFonts w:ascii="Arial" w:cs="Arial" w:eastAsia="Arial" w:hAnsi="Arial"/>
+          <w:i/>
+          <w:iCs/>
+          <w:sz w:val="19"/>
+          <w:szCs w:val="19"/>
+        </w:rPr>
+        <w:t xml:space="preserve">	Month Year - Present</w:t>
+      </w:r>
+    </w:p>
+    <w:p>
+      <w:pPr>
+        <w:pStyle w:val="ListParagraph"/>
+        <w:numPr>
+          <w:ilvl w:val="0"/>
+          <w:numId w:val="2"/>
+        </w:numPr>
+      </w:pPr>
+      <w:r>
+        <w:rPr>
+          <w:rFonts w:ascii="Arial" w:cs="Arial" w:eastAsia="Arial" w:hAnsi="Arial"/>
+          <w:sz w:val="19"/>
+          <w:szCs w:val="19"/>
+        </w:rPr>
+        <w:t xml:space="preserve">Your main responsibility, starting with a verb</w:t>
+      </w:r>
+    </w:p>
+    <w:p>
+      <w:pPr>
+        <w:pStyle w:val="ListParagraph"/>
+        <w:numPr>
+          <w:ilvl w:val="0"/>
+          <w:numId w:val="2"/>
+        </w:numPr>
+      </w:pPr>
+      <w:r>
+        <w:rPr>
+          <w:rFonts w:ascii="Arial" w:cs="Arial" w:eastAsia="Arial" w:hAnsi="Arial"/>
+          <w:sz w:val="19"/>
+          <w:szCs w:val="19"/>
+        </w:rPr>
+        <w:t xml:space="preserve">Something you improved or were trusted with</w:t>
+      </w:r>
+    </w:p>
+    <w:p>
+      <w:pPr>
+        <w:keepNext/>
+        <w:pBdr>
+          <w:bottom w:val="single" w:color="111111" w:sz="6" w:space="1"/>
+        </w:pBdr>
+        <w:spacing w:after="50" w:before="150"/>
+      </w:pPr>
+      <w:r>
+        <w:rPr>
+          <w:rFonts w:ascii="Arial" w:cs="Arial" w:eastAsia="Arial" w:hAnsi="Arial"/>
+          <w:b/>
+          <w:bCs/>
+          <w:smallCaps/>
+          <w:sz w:val="23"/>
+          <w:szCs w:val="23"/>
+        </w:rPr>
+        <w:t xml:space="preserve">Leadership and Volunteering</w:t>
+      </w:r>
+    </w:p>
+    <w:p>
+      <w:pPr>
+        <w:keepNext/>
+        <w:tabs>
+          <w:tab w:val="right" w:pos="10432"/>
+        </w:tabs>
+        <w:spacing w:before="70"/>
+      </w:pPr>
+      <w:r>
+        <w:rPr>
+          <w:rFonts w:ascii="Arial" w:cs="Arial" w:eastAsia="Arial" w:hAnsi="Arial"/>
+          <w:b/>
+          <w:bCs/>
+          <w:sz w:val="20"/>
+          <w:szCs w:val="20"/>
+        </w:rPr>
+        <w:t xml:space="preserve">Society or Volunteer Role</w:t>
+      </w:r>
+      <w:r>
+        <w:rPr>
+          <w:rFonts w:ascii="Arial" w:cs="Arial" w:eastAsia="Arial" w:hAnsi="Arial"/>
+          <w:sz w:val="19"/>
+          <w:szCs w:val="19"/>
+        </w:rPr>
+        <w:t xml:space="preserve">	</w:t>
+      </w:r>
+      <w:r>
+        <w:rPr>
+          <w:rFonts w:ascii="Arial" w:cs="Arial" w:eastAsia="Arial" w:hAnsi="Arial"/>
+          <w:b/>
+          <w:bCs/>
+          <w:i/>
+          <w:iCs/>
+          <w:sz w:val="19"/>
+          <w:szCs w:val="19"/>
+        </w:rPr>
+        <w:t xml:space="preserve">Organisation Name</w:t>
+      </w:r>
+    </w:p>
+    <w:p>
+      <w:pPr>
+        <w:keepNext/>
+        <w:tabs>
+          <w:tab w:val="right" w:pos="10432"/>
+        </w:tabs>
+      </w:pPr>
+      <w:r>
+        <w:rPr>
+          <w:rFonts w:ascii="Arial" w:cs="Arial" w:eastAsia="Arial" w:hAnsi="Arial"/>
+          <w:i/>
+          <w:iCs/>
+          <w:sz w:val="19"/>
+          <w:szCs w:val="19"/>
+        </w:rPr>
+        <w:t xml:space="preserve">	Month Year - Present</w:t>
+      </w:r>
+    </w:p>
+    <w:p>
+      <w:pPr>
+        <w:pStyle w:val="ListParagraph"/>
+        <w:numPr>
+          <w:ilvl w:val="0"/>
+          <w:numId w:val="2"/>
+        </w:numPr>
+      </w:pPr>
+      <w:r>
+        <w:rPr>
+          <w:rFonts w:ascii="Arial" w:cs="Arial" w:eastAsia="Arial" w:hAnsi="Arial"/>
+          <w:sz w:val="19"/>
+          <w:szCs w:val="19"/>
+        </w:rPr>
+        <w:t xml:space="preserve">What you lead or do and who it helps, with a number where you have one</w:t>
+      </w:r>
+    </w:p>
+    <w:p>
+      <w:pPr>
+        <w:keepNext/>
+        <w:pBdr>
+          <w:bottom w:val="single" w:color="111111" w:sz="6" w:space="1"/>
+        </w:pBdr>
+        <w:spacing w:after="50" w:before="150"/>
+      </w:pPr>
+      <w:r>
+        <w:rPr>
+          <w:rFonts w:ascii="Arial" w:cs="Arial" w:eastAsia="Arial" w:hAnsi="Arial"/>
+          <w:b/>
+          <w:bCs/>
+          <w:smallCaps/>
+          <w:sz w:val="23"/>
+          <w:szCs w:val="23"/>
+        </w:rPr>
+        <w:t xml:space="preserve">Research and Publications</w:t>
+      </w:r>
+    </w:p>
+    <w:p>
+      <w:pPr>
+        <w:keepNext/>
+        <w:tabs>
+          <w:tab w:val="right" w:pos="10432"/>
+        </w:tabs>
+        <w:spacing w:before="70"/>
+      </w:pPr>
+      <w:r>
+        <w:rPr>
+          <w:rFonts w:ascii="Arial" w:cs="Arial" w:eastAsia="Arial" w:hAnsi="Arial"/>
+          <w:b/>
+          <w:bCs/>
+          <w:sz w:val="20"/>
+          <w:szCs w:val="20"/>
+        </w:rPr>
         <w:t xml:space="preserve">Publication or Report Title</w:t>
       </w:r>
       <w:r>
@@ -929,7 +1174,7 @@
         </w:rPr>
         <w:t xml:space="preserve">	</w:t>
       </w:r>
-      <w:hyperlink w:history="1" r:id="rIdtnxaylw42kwzp8yrohoxo">
+      <w:hyperlink w:history="1" r:id="rIdo-ki4q-16ktlbslqtfdpa">
         <w:r>
           <w:rPr>
             <w:rStyle w:val="Hyperlink"/>
@@ -948,7 +1193,7 @@
         </w:rPr>
         <w:t xml:space="preserve"> | </w:t>
       </w:r>
-      <w:hyperlink w:history="1" r:id="rIdtr79hj0icqihf3n4mjrfz">
+      <w:hyperlink w:history="1" r:id="rId7fhj7owjtkmjpqrk7zczs">
         <w:r>
           <w:rPr>
             <w:rStyle w:val="Hyperlink"/>
@@ -1022,74 +1267,7 @@
           <w:sz w:val="23"/>
           <w:szCs w:val="23"/>
         </w:rPr>
-        <w:t xml:space="preserve">Experience</w:t>
-      </w:r>
-    </w:p>
-    <w:p>
-      <w:pPr>
-        <w:keepNext/>
-        <w:tabs>
-          <w:tab w:val="right" w:pos="10432"/>
-        </w:tabs>
-        <w:spacing w:before="70"/>
-      </w:pPr>
-      <w:r>
-        <w:rPr>
-          <w:rFonts w:ascii="Arial" w:cs="Arial" w:eastAsia="Arial" w:hAnsi="Arial"/>
-          <w:b/>
-          <w:bCs/>
-          <w:sz w:val="20"/>
-          <w:szCs w:val="20"/>
-        </w:rPr>
-        <w:t xml:space="preserve">Job Title</w:t>
-      </w:r>
-      <w:r>
-        <w:rPr>
-          <w:rFonts w:ascii="Arial" w:cs="Arial" w:eastAsia="Arial" w:hAnsi="Arial"/>
-          <w:sz w:val="19"/>
-          <w:szCs w:val="19"/>
-        </w:rPr>
-        <w:t xml:space="preserve">	</w:t>
-      </w:r>
-      <w:r>
-        <w:rPr>
-          <w:rFonts w:ascii="Arial" w:cs="Arial" w:eastAsia="Arial" w:hAnsi="Arial"/>
-          <w:b/>
-          <w:bCs/>
-          <w:i/>
-          <w:iCs/>
-          <w:sz w:val="19"/>
-          <w:szCs w:val="19"/>
-        </w:rPr>
-        <w:t xml:space="preserve">Organisation Name, City</w:t>
-      </w:r>
-    </w:p>
-    <w:p>
-      <w:pPr>
-        <w:keepNext/>
-        <w:tabs>
-          <w:tab w:val="right" w:pos="10432"/>
-        </w:tabs>
-      </w:pPr>
-      <w:r>
-        <w:rPr>
-          <w:rFonts w:ascii="Arial" w:cs="Arial" w:eastAsia="Arial" w:hAnsi="Arial"/>
-          <w:i/>
-          <w:iCs/>
-          <w:sz w:val="19"/>
-          <w:szCs w:val="19"/>
-        </w:rPr>
-        <w:t xml:space="preserve">Three skills this role used</w:t>
-      </w:r>
-      <w:r>
-        <w:rPr>
-          <w:rFonts w:ascii="Arial" w:cs="Arial" w:eastAsia="Arial" w:hAnsi="Arial"/>
-          <w:i/>
-          <w:iCs/>
-          <w:sz w:val="19"/>
-          <w:szCs w:val="19"/>
-        </w:rPr>
-        <w:t xml:space="preserve">	Month Year - Present</w:t>
+        <w:t xml:space="preserve">Achievements</w:t>
       </w:r>
     </w:p>
     <w:p>
@@ -1103,10 +1281,20 @@
       <w:r>
         <w:rPr>
           <w:rFonts w:ascii="Arial" w:cs="Arial" w:eastAsia="Arial" w:hAnsi="Arial"/>
-          <w:sz w:val="19"/>
-          <w:szCs w:val="19"/>
-        </w:rPr>
-        <w:t xml:space="preserve">Your main responsibility, starting with a verb</w:t>
+          <w:b/>
+          <w:bCs/>
+          <w:sz w:val="19"/>
+          <w:szCs w:val="19"/>
+        </w:rPr>
+        <w:t xml:space="preserve">Award or achievement</w:t>
+      </w:r>
+      <w:r>
+        <w:rPr>
+          <w:rFonts w:ascii="Arial" w:cs="Arial" w:eastAsia="Arial" w:hAnsi="Arial"/>
+          <w:sz w:val="19"/>
+          <w:szCs w:val="19"/>
+        </w:rPr>
+        <w:t xml:space="preserve">, organisation and year</w:t>
       </w:r>
     </w:p>
     <w:p>
@@ -1120,248 +1308,6 @@
       <w:r>
         <w:rPr>
           <w:rFonts w:ascii="Arial" w:cs="Arial" w:eastAsia="Arial" w:hAnsi="Arial"/>
-          <w:sz w:val="19"/>
-          <w:szCs w:val="19"/>
-        </w:rPr>
-        <w:t xml:space="preserve">Something you improved or were trusted with</w:t>
-      </w:r>
-    </w:p>
-    <w:p>
-      <w:pPr>
-        <w:keepNext/>
-        <w:tabs>
-          <w:tab w:val="right" w:pos="10432"/>
-        </w:tabs>
-        <w:spacing w:before="70"/>
-      </w:pPr>
-      <w:r>
-        <w:rPr>
-          <w:rFonts w:ascii="Arial" w:cs="Arial" w:eastAsia="Arial" w:hAnsi="Arial"/>
-          <w:b/>
-          <w:bCs/>
-          <w:sz w:val="20"/>
-          <w:szCs w:val="20"/>
-        </w:rPr>
-        <w:t xml:space="preserve">Job Title (part-time)</w:t>
-      </w:r>
-      <w:r>
-        <w:rPr>
-          <w:rFonts w:ascii="Arial" w:cs="Arial" w:eastAsia="Arial" w:hAnsi="Arial"/>
-          <w:sz w:val="19"/>
-          <w:szCs w:val="19"/>
-        </w:rPr>
-        <w:t xml:space="preserve">	</w:t>
-      </w:r>
-      <w:r>
-        <w:rPr>
-          <w:rFonts w:ascii="Arial" w:cs="Arial" w:eastAsia="Arial" w:hAnsi="Arial"/>
-          <w:b/>
-          <w:bCs/>
-          <w:i/>
-          <w:iCs/>
-          <w:sz w:val="19"/>
-          <w:szCs w:val="19"/>
-        </w:rPr>
-        <w:t xml:space="preserve">Organisation Name, City</w:t>
-      </w:r>
-    </w:p>
-    <w:p>
-      <w:pPr>
-        <w:keepNext/>
-        <w:tabs>
-          <w:tab w:val="right" w:pos="10432"/>
-        </w:tabs>
-      </w:pPr>
-      <w:r>
-        <w:rPr>
-          <w:rFonts w:ascii="Arial" w:cs="Arial" w:eastAsia="Arial" w:hAnsi="Arial"/>
-          <w:i/>
-          <w:iCs/>
-          <w:sz w:val="19"/>
-          <w:szCs w:val="19"/>
-        </w:rPr>
-        <w:t xml:space="preserve">Three skills this role used</w:t>
-      </w:r>
-      <w:r>
-        <w:rPr>
-          <w:rFonts w:ascii="Arial" w:cs="Arial" w:eastAsia="Arial" w:hAnsi="Arial"/>
-          <w:i/>
-          <w:iCs/>
-          <w:sz w:val="19"/>
-          <w:szCs w:val="19"/>
-        </w:rPr>
-        <w:t xml:space="preserve">	Month Year - Month Year</w:t>
-      </w:r>
-    </w:p>
-    <w:p>
-      <w:pPr>
-        <w:pStyle w:val="ListParagraph"/>
-        <w:numPr>
-          <w:ilvl w:val="0"/>
-          <w:numId w:val="2"/>
-        </w:numPr>
-      </w:pPr>
-      <w:r>
-        <w:rPr>
-          <w:rFonts w:ascii="Arial" w:cs="Arial" w:eastAsia="Arial" w:hAnsi="Arial"/>
-          <w:sz w:val="19"/>
-          <w:szCs w:val="19"/>
-        </w:rPr>
-        <w:t xml:space="preserve">Your main responsibility, starting with a verb</w:t>
-      </w:r>
-    </w:p>
-    <w:p>
-      <w:pPr>
-        <w:keepNext/>
-        <w:pBdr>
-          <w:bottom w:val="single" w:color="111111" w:sz="6" w:space="1"/>
-        </w:pBdr>
-        <w:spacing w:after="50" w:before="150"/>
-      </w:pPr>
-      <w:r>
-        <w:rPr>
-          <w:rFonts w:ascii="Arial" w:cs="Arial" w:eastAsia="Arial" w:hAnsi="Arial"/>
-          <w:b/>
-          <w:bCs/>
-          <w:smallCaps/>
-          <w:sz w:val="23"/>
-          <w:szCs w:val="23"/>
-        </w:rPr>
-        <w:t xml:space="preserve">Leadership and Volunteering</w:t>
-      </w:r>
-    </w:p>
-    <w:p>
-      <w:pPr>
-        <w:keepNext/>
-        <w:tabs>
-          <w:tab w:val="right" w:pos="10432"/>
-        </w:tabs>
-        <w:spacing w:before="70"/>
-      </w:pPr>
-      <w:r>
-        <w:rPr>
-          <w:rFonts w:ascii="Arial" w:cs="Arial" w:eastAsia="Arial" w:hAnsi="Arial"/>
-          <w:b/>
-          <w:bCs/>
-          <w:sz w:val="20"/>
-          <w:szCs w:val="20"/>
-        </w:rPr>
-        <w:t xml:space="preserve">Society or Volunteer Role</w:t>
-      </w:r>
-      <w:r>
-        <w:rPr>
-          <w:rFonts w:ascii="Arial" w:cs="Arial" w:eastAsia="Arial" w:hAnsi="Arial"/>
-          <w:sz w:val="19"/>
-          <w:szCs w:val="19"/>
-        </w:rPr>
-        <w:t xml:space="preserve">	</w:t>
-      </w:r>
-      <w:r>
-        <w:rPr>
-          <w:rFonts w:ascii="Arial" w:cs="Arial" w:eastAsia="Arial" w:hAnsi="Arial"/>
-          <w:b/>
-          <w:bCs/>
-          <w:i/>
-          <w:iCs/>
-          <w:sz w:val="19"/>
-          <w:szCs w:val="19"/>
-        </w:rPr>
-        <w:t xml:space="preserve">Organisation Name</w:t>
-      </w:r>
-    </w:p>
-    <w:p>
-      <w:pPr>
-        <w:keepNext/>
-        <w:tabs>
-          <w:tab w:val="right" w:pos="10432"/>
-        </w:tabs>
-      </w:pPr>
-      <w:r>
-        <w:rPr>
-          <w:rFonts w:ascii="Arial" w:cs="Arial" w:eastAsia="Arial" w:hAnsi="Arial"/>
-          <w:i/>
-          <w:iCs/>
-          <w:sz w:val="19"/>
-          <w:szCs w:val="19"/>
-        </w:rPr>
-        <w:t xml:space="preserve">	Month Year - Present</w:t>
-      </w:r>
-    </w:p>
-    <w:p>
-      <w:pPr>
-        <w:pStyle w:val="ListParagraph"/>
-        <w:numPr>
-          <w:ilvl w:val="0"/>
-          <w:numId w:val="2"/>
-        </w:numPr>
-      </w:pPr>
-      <w:r>
-        <w:rPr>
-          <w:rFonts w:ascii="Arial" w:cs="Arial" w:eastAsia="Arial" w:hAnsi="Arial"/>
-          <w:sz w:val="19"/>
-          <w:szCs w:val="19"/>
-        </w:rPr>
-        <w:t xml:space="preserve">What you lead or do and who it helps, with a number where you have one</w:t>
-      </w:r>
-    </w:p>
-    <w:p>
-      <w:pPr>
-        <w:keepNext/>
-        <w:pBdr>
-          <w:bottom w:val="single" w:color="111111" w:sz="6" w:space="1"/>
-        </w:pBdr>
-        <w:spacing w:after="50" w:before="150"/>
-      </w:pPr>
-      <w:r>
-        <w:rPr>
-          <w:rFonts w:ascii="Arial" w:cs="Arial" w:eastAsia="Arial" w:hAnsi="Arial"/>
-          <w:b/>
-          <w:bCs/>
-          <w:smallCaps/>
-          <w:sz w:val="23"/>
-          <w:szCs w:val="23"/>
-        </w:rPr>
-        <w:t xml:space="preserve">Achievements</w:t>
-      </w:r>
-    </w:p>
-    <w:p>
-      <w:pPr>
-        <w:pStyle w:val="ListParagraph"/>
-        <w:numPr>
-          <w:ilvl w:val="0"/>
-          <w:numId w:val="2"/>
-        </w:numPr>
-      </w:pPr>
-      <w:r>
-        <w:rPr>
-          <w:rFonts w:ascii="Arial" w:cs="Arial" w:eastAsia="Arial" w:hAnsi="Arial"/>
-          <w:b/>
-          <w:bCs/>
-          <w:sz w:val="19"/>
-          <w:szCs w:val="19"/>
-        </w:rPr>
-        <w:t xml:space="preserve">Award or achievement</w:t>
-      </w:r>
-      <w:r>
-        <w:rPr>
-          <w:rFonts w:ascii="Arial" w:cs="Arial" w:eastAsia="Arial" w:hAnsi="Arial"/>
-          <w:sz w:val="19"/>
-          <w:szCs w:val="19"/>
-        </w:rPr>
-        <w:t xml:space="preserve">, organisation and year</w:t>
-      </w:r>
-    </w:p>
-    <w:p>
-      <w:pPr>
-        <w:pStyle w:val="ListParagraph"/>
-        <w:numPr>
-          <w:ilvl w:val="0"/>
-          <w:numId w:val="2"/>
-        </w:numPr>
-      </w:pPr>
-      <w:r>
-        <w:rPr>
-          <w:rFonts w:ascii="Arial" w:cs="Arial" w:eastAsia="Arial" w:hAnsi="Arial"/>
           <w:b/>
           <w:bCs/>
           <w:sz w:val="19"/>
@@ -1385,7 +1331,7 @@
         </w:rPr>
         <w:t xml:space="preserve">: </w:t>
       </w:r>
-      <w:hyperlink w:history="1" r:id="rIdyv0t5oy-0kgwcrslu-il5">
+      <w:hyperlink w:history="1" r:id="rIdkbmgnu7ltqifmiee2ucml">
         <w:r>
           <w:rPr>
             <w:rStyle w:val="Hyperlink"/>

</xml_diff>

<commit_message>
feat: add Additional Information and skills lines
Closes #22
</commit_message>
<xml_diff>
--- a/cv/cv.docx
+++ b/cv/cv.docx
@@ -32,7 +32,7 @@
         </w:rPr>
         <w:t xml:space="preserve">  |  </w:t>
       </w:r>
-      <w:hyperlink w:history="1" r:id="rIdkjjz1ouxn7mtrn269eafo">
+      <w:hyperlink w:history="1" r:id="rId6aiato4aw_adagetim2xa">
         <w:r>
           <w:rPr>
             <w:rStyle w:val="Hyperlink"/>
@@ -51,7 +51,7 @@
         </w:rPr>
         <w:t xml:space="preserve">  |  </w:t>
       </w:r>
-      <w:hyperlink w:history="1" r:id="rId1cz7cn59xrxcrocdlo0n-">
+      <w:hyperlink w:history="1" r:id="rId_cpp_cxnhdwviyrtb1w_p">
         <w:r>
           <w:rPr>
             <w:rStyle w:val="Hyperlink"/>
@@ -67,7 +67,7 @@
       <w:pPr>
         <w:spacing w:after="60"/>
       </w:pPr>
-      <w:hyperlink w:history="1" r:id="rIdzt-e7ssdzpo3xb1kbljcd">
+      <w:hyperlink w:history="1" r:id="rIdddhljnx7vvac8ly8imgiz">
         <w:r>
           <w:rPr>
             <w:rStyle w:val="Hyperlink"/>
@@ -86,7 +86,7 @@
         </w:rPr>
         <w:t xml:space="preserve">  |  </w:t>
       </w:r>
-      <w:hyperlink w:history="1" r:id="rIdbrt0hggyvpmh6khu9peu3">
+      <w:hyperlink w:history="1" r:id="rIdgwidy_tbvhefmpoi_smuj">
         <w:r>
           <w:rPr>
             <w:rStyle w:val="Hyperlink"/>
@@ -105,7 +105,7 @@
         </w:rPr>
         <w:t xml:space="preserve">  |  </w:t>
       </w:r>
-      <w:hyperlink w:history="1" r:id="rIdgschmv9mllcfi7iljv0f0">
+      <w:hyperlink w:history="1" r:id="rIdgjvaspbijqiyf2qlcyev7">
         <w:r>
           <w:rPr>
             <w:rStyle w:val="Hyperlink"/>
@@ -563,7 +563,7 @@
         </w:rPr>
         <w:t xml:space="preserve">	</w:t>
       </w:r>
-      <w:hyperlink w:history="1" r:id="rIdkkuciev6iuusffugpo8xf">
+      <w:hyperlink w:history="1" r:id="rIdhxnlfxpdxumpt1_l4e70q">
         <w:r>
           <w:rPr>
             <w:rStyle w:val="Hyperlink"/>
@@ -582,7 +582,7 @@
         </w:rPr>
         <w:t xml:space="preserve"> | </w:t>
       </w:r>
-      <w:hyperlink w:history="1" r:id="rIdcycvg-94a46b1o4r66iip">
+      <w:hyperlink w:history="1" r:id="rIdwhpqyrbw-aew6lvvuwp-u">
         <w:r>
           <w:rPr>
             <w:rStyle w:val="Hyperlink"/>
@@ -601,7 +601,7 @@
         </w:rPr>
         <w:t xml:space="preserve"> | </w:t>
       </w:r>
-      <w:hyperlink w:history="1" r:id="rIdhl4mhdj2oiofymsyfce5h">
+      <w:hyperlink w:history="1" r:id="rIdvacqel75-iq2tkioaz8vs">
         <w:r>
           <w:rPr>
             <w:rStyle w:val="Hyperlink"/>
@@ -719,7 +719,7 @@
         </w:rPr>
         <w:t xml:space="preserve">	</w:t>
       </w:r>
-      <w:hyperlink w:history="1" r:id="rIdddmisar9th1kibfnkdfc3">
+      <w:hyperlink w:history="1" r:id="rIdt2gcwylmw5hyju9yprls1">
         <w:r>
           <w:rPr>
             <w:rStyle w:val="Hyperlink"/>
@@ -738,7 +738,7 @@
         </w:rPr>
         <w:t xml:space="preserve"> | </w:t>
       </w:r>
-      <w:hyperlink w:history="1" r:id="rIdmh-plxilwnzrt2ovumk5p">
+      <w:hyperlink w:history="1" r:id="rIdjdlukp4wtfq3bxwyca-3l">
         <w:r>
           <w:rPr>
             <w:rStyle w:val="Hyperlink"/>
@@ -856,7 +856,7 @@
         </w:rPr>
         <w:t xml:space="preserve">	</w:t>
       </w:r>
-      <w:hyperlink w:history="1" r:id="rIdypapdp7_92cjkeedreo_b">
+      <w:hyperlink w:history="1" r:id="rId3r65gun4jtv-248j-sjku">
         <w:r>
           <w:rPr>
             <w:rStyle w:val="Hyperlink"/>
@@ -1019,6 +1019,93 @@
     </w:p>
     <w:p>
       <w:pPr>
+        <w:keepNext/>
+        <w:pBdr>
+          <w:bottom w:val="single" w:color="111111" w:sz="6" w:space="1"/>
+        </w:pBdr>
+        <w:spacing w:after="50" w:before="150"/>
+      </w:pPr>
+      <w:r>
+        <w:rPr>
+          <w:rFonts w:ascii="Arial" w:cs="Arial" w:eastAsia="Arial" w:hAnsi="Arial"/>
+          <w:b/>
+          <w:bCs/>
+          <w:smallCaps/>
+          <w:sz w:val="23"/>
+          <w:szCs w:val="23"/>
+        </w:rPr>
+        <w:t xml:space="preserve">Leadership and Volunteering</w:t>
+      </w:r>
+    </w:p>
+    <w:p>
+      <w:pPr>
+        <w:keepNext/>
+        <w:tabs>
+          <w:tab w:val="right" w:pos="10432"/>
+        </w:tabs>
+        <w:spacing w:before="70"/>
+      </w:pPr>
+      <w:r>
+        <w:rPr>
+          <w:rFonts w:ascii="Arial" w:cs="Arial" w:eastAsia="Arial" w:hAnsi="Arial"/>
+          <w:b/>
+          <w:bCs/>
+          <w:sz w:val="20"/>
+          <w:szCs w:val="20"/>
+        </w:rPr>
+        <w:t xml:space="preserve">Society or Volunteer Role</w:t>
+      </w:r>
+      <w:r>
+        <w:rPr>
+          <w:rFonts w:ascii="Arial" w:cs="Arial" w:eastAsia="Arial" w:hAnsi="Arial"/>
+          <w:sz w:val="19"/>
+          <w:szCs w:val="19"/>
+        </w:rPr>
+        <w:t xml:space="preserve">	</w:t>
+      </w:r>
+      <w:r>
+        <w:rPr>
+          <w:rFonts w:ascii="Arial" w:cs="Arial" w:eastAsia="Arial" w:hAnsi="Arial"/>
+          <w:b/>
+          <w:bCs/>
+          <w:i/>
+          <w:iCs/>
+          <w:sz w:val="19"/>
+          <w:szCs w:val="19"/>
+        </w:rPr>
+        <w:t xml:space="preserve">Organisation Name</w:t>
+      </w:r>
+    </w:p>
+    <w:p>
+      <w:pPr>
+        <w:keepNext/>
+        <w:tabs>
+          <w:tab w:val="right" w:pos="10432"/>
+        </w:tabs>
+      </w:pPr>
+      <w:r>
+        <w:rPr>
+          <w:rFonts w:ascii="Arial" w:cs="Arial" w:eastAsia="Arial" w:hAnsi="Arial"/>
+          <w:i/>
+          <w:iCs/>
+          <w:sz w:val="19"/>
+          <w:szCs w:val="19"/>
+        </w:rPr>
+        <w:t xml:space="preserve">Three skills this role used</w:t>
+      </w:r>
+      <w:r>
+        <w:rPr>
+          <w:rFonts w:ascii="Arial" w:cs="Arial" w:eastAsia="Arial" w:hAnsi="Arial"/>
+          <w:i/>
+          <w:iCs/>
+          <w:sz w:val="19"/>
+          <w:szCs w:val="19"/>
+        </w:rPr>
+        <w:t xml:space="preserve">	Month Year - Present</w:t>
+      </w:r>
+    </w:p>
+    <w:p>
+      <w:pPr>
         <w:pStyle w:val="ListParagraph"/>
         <w:numPr>
           <w:ilvl w:val="0"/>
@@ -1031,7 +1118,7 @@
           <w:sz w:val="19"/>
           <w:szCs w:val="19"/>
         </w:rPr>
-        <w:t xml:space="preserve">Something you improved or were trusted with</w:t>
+        <w:t xml:space="preserve">What you lead or do and who it helps, with a number where you have one</w:t>
       </w:r>
     </w:p>
     <w:p>
@@ -1051,7 +1138,7 @@
           <w:sz w:val="23"/>
           <w:szCs w:val="23"/>
         </w:rPr>
-        <w:t xml:space="preserve">Leadership and Volunteering</w:t>
+        <w:t xml:space="preserve">Research and Publications</w:t>
       </w:r>
     </w:p>
     <w:p>
@@ -1070,7 +1157,7 @@
           <w:sz w:val="20"/>
           <w:szCs w:val="20"/>
         </w:rPr>
-        <w:t xml:space="preserve">Society or Volunteer Role</w:t>
+        <w:t xml:space="preserve">Publication or Report Title</w:t>
       </w:r>
       <w:r>
         <w:rPr>
@@ -1080,101 +1167,7 @@
         </w:rPr>
         <w:t xml:space="preserve">	</w:t>
       </w:r>
-      <w:r>
-        <w:rPr>
-          <w:rFonts w:ascii="Arial" w:cs="Arial" w:eastAsia="Arial" w:hAnsi="Arial"/>
-          <w:b/>
-          <w:bCs/>
-          <w:i/>
-          <w:iCs/>
-          <w:sz w:val="19"/>
-          <w:szCs w:val="19"/>
-        </w:rPr>
-        <w:t xml:space="preserve">Organisation Name</w:t>
-      </w:r>
-    </w:p>
-    <w:p>
-      <w:pPr>
-        <w:keepNext/>
-        <w:tabs>
-          <w:tab w:val="right" w:pos="10432"/>
-        </w:tabs>
-      </w:pPr>
-      <w:r>
-        <w:rPr>
-          <w:rFonts w:ascii="Arial" w:cs="Arial" w:eastAsia="Arial" w:hAnsi="Arial"/>
-          <w:i/>
-          <w:iCs/>
-          <w:sz w:val="19"/>
-          <w:szCs w:val="19"/>
-        </w:rPr>
-        <w:t xml:space="preserve">	Month Year - Present</w:t>
-      </w:r>
-    </w:p>
-    <w:p>
-      <w:pPr>
-        <w:pStyle w:val="ListParagraph"/>
-        <w:numPr>
-          <w:ilvl w:val="0"/>
-          <w:numId w:val="2"/>
-        </w:numPr>
-      </w:pPr>
-      <w:r>
-        <w:rPr>
-          <w:rFonts w:ascii="Arial" w:cs="Arial" w:eastAsia="Arial" w:hAnsi="Arial"/>
-          <w:sz w:val="19"/>
-          <w:szCs w:val="19"/>
-        </w:rPr>
-        <w:t xml:space="preserve">What you lead or do and who it helps, with a number where you have one</w:t>
-      </w:r>
-    </w:p>
-    <w:p>
-      <w:pPr>
-        <w:keepNext/>
-        <w:pBdr>
-          <w:bottom w:val="single" w:color="111111" w:sz="6" w:space="1"/>
-        </w:pBdr>
-        <w:spacing w:after="50" w:before="150"/>
-      </w:pPr>
-      <w:r>
-        <w:rPr>
-          <w:rFonts w:ascii="Arial" w:cs="Arial" w:eastAsia="Arial" w:hAnsi="Arial"/>
-          <w:b/>
-          <w:bCs/>
-          <w:smallCaps/>
-          <w:sz w:val="23"/>
-          <w:szCs w:val="23"/>
-        </w:rPr>
-        <w:t xml:space="preserve">Research and Publications</w:t>
-      </w:r>
-    </w:p>
-    <w:p>
-      <w:pPr>
-        <w:keepNext/>
-        <w:tabs>
-          <w:tab w:val="right" w:pos="10432"/>
-        </w:tabs>
-        <w:spacing w:before="70"/>
-      </w:pPr>
-      <w:r>
-        <w:rPr>
-          <w:rFonts w:ascii="Arial" w:cs="Arial" w:eastAsia="Arial" w:hAnsi="Arial"/>
-          <w:b/>
-          <w:bCs/>
-          <w:sz w:val="20"/>
-          <w:szCs w:val="20"/>
-        </w:rPr>
-        <w:t xml:space="preserve">Publication or Report Title</w:t>
-      </w:r>
-      <w:r>
-        <w:rPr>
-          <w:rFonts w:ascii="Arial" w:cs="Arial" w:eastAsia="Arial" w:hAnsi="Arial"/>
-          <w:sz w:val="19"/>
-          <w:szCs w:val="19"/>
-        </w:rPr>
-        <w:t xml:space="preserve">	</w:t>
-      </w:r>
-      <w:hyperlink w:history="1" r:id="rIdo-ki4q-16ktlbslqtfdpa">
+      <w:hyperlink w:history="1" r:id="rId-u-knj1vzjn1ff84w6oxw">
         <w:r>
           <w:rPr>
             <w:rStyle w:val="Hyperlink"/>
@@ -1193,7 +1186,7 @@
         </w:rPr>
         <w:t xml:space="preserve"> | </w:t>
       </w:r>
-      <w:hyperlink w:history="1" r:id="rId7fhj7owjtkmjpqrk7zczs">
+      <w:hyperlink w:history="1" r:id="rIdtnzuoqfb1u0m97us9fpud">
         <w:r>
           <w:rPr>
             <w:rStyle w:val="Hyperlink"/>
@@ -1220,17 +1213,17 @@
           <w:sz w:val="19"/>
           <w:szCs w:val="19"/>
         </w:rPr>
-        <w:t xml:space="preserve">Full title. Your Initial. Surname, Publisher or Repository, Year</w:t>
-      </w:r>
-      <w:r>
-        <w:rPr>
-          <w:rFonts w:ascii="Arial" w:cs="Arial" w:eastAsia="Arial" w:hAnsi="Arial"/>
-          <w:i/>
-          <w:iCs/>
-          <w:sz w:val="19"/>
-          <w:szCs w:val="19"/>
-        </w:rPr>
-        <w:t xml:space="preserve">	</w:t>
+        <w:t xml:space="preserve">Type of work: Full Title</w:t>
+      </w:r>
+      <w:r>
+        <w:rPr>
+          <w:rFonts w:ascii="Arial" w:cs="Arial" w:eastAsia="Arial" w:hAnsi="Arial"/>
+          <w:i/>
+          <w:iCs/>
+          <w:sz w:val="19"/>
+          <w:szCs w:val="19"/>
+        </w:rPr>
+        <w:t xml:space="preserve">	Publisher or Repository, Month Year</w:t>
       </w:r>
     </w:p>
     <w:p>
@@ -1331,7 +1324,7 @@
         </w:rPr>
         <w:t xml:space="preserve">: </w:t>
       </w:r>
-      <w:hyperlink w:history="1" r:id="rIdkbmgnu7ltqifmiee2ucml">
+      <w:hyperlink w:history="1" r:id="rId4j03oh2iwgv9hmuf8aeis">
         <w:r>
           <w:rPr>
             <w:rStyle w:val="Hyperlink"/>
@@ -1360,10 +1353,20 @@
           <w:sz w:val="23"/>
           <w:szCs w:val="23"/>
         </w:rPr>
-        <w:t xml:space="preserve">Spoken Languages</w:t>
-      </w:r>
-    </w:p>
-    <w:p>
+        <w:t xml:space="preserve">Additional Information</w:t>
+      </w:r>
+    </w:p>
+    <w:p>
+      <w:r>
+        <w:rPr>
+          <w:rFonts w:ascii="Arial" w:cs="Arial" w:eastAsia="Arial" w:hAnsi="Arial"/>
+          <w:b/>
+          <w:bCs/>
+          <w:sz w:val="19"/>
+          <w:szCs w:val="19"/>
+        </w:rPr>
+        <w:t xml:space="preserve">Languages: </w:t>
+      </w:r>
       <w:r>
         <w:rPr>
           <w:rFonts w:ascii="Arial" w:cs="Arial" w:eastAsia="Arial" w:hAnsi="Arial"/>
@@ -1371,6 +1374,46 @@
           <w:szCs w:val="19"/>
         </w:rPr>
         <w:t xml:space="preserve">Language (fluent), Language (conversational)</w:t>
+      </w:r>
+    </w:p>
+    <w:p>
+      <w:r>
+        <w:rPr>
+          <w:rFonts w:ascii="Arial" w:cs="Arial" w:eastAsia="Arial" w:hAnsi="Arial"/>
+          <w:b/>
+          <w:bCs/>
+          <w:sz w:val="19"/>
+          <w:szCs w:val="19"/>
+        </w:rPr>
+        <w:t xml:space="preserve">Certifications: </w:t>
+      </w:r>
+      <w:r>
+        <w:rPr>
+          <w:rFonts w:ascii="Arial" w:cs="Arial" w:eastAsia="Arial" w:hAnsi="Arial"/>
+          <w:sz w:val="19"/>
+          <w:szCs w:val="19"/>
+        </w:rPr>
+        <w:t xml:space="preserve">Certificate Name (Issuer, Year)</w:t>
+      </w:r>
+    </w:p>
+    <w:p>
+      <w:r>
+        <w:rPr>
+          <w:rFonts w:ascii="Arial" w:cs="Arial" w:eastAsia="Arial" w:hAnsi="Arial"/>
+          <w:b/>
+          <w:bCs/>
+          <w:sz w:val="19"/>
+          <w:szCs w:val="19"/>
+        </w:rPr>
+        <w:t xml:space="preserve">Interests: </w:t>
+      </w:r>
+      <w:r>
+        <w:rPr>
+          <w:rFonts w:ascii="Arial" w:cs="Arial" w:eastAsia="Arial" w:hAnsi="Arial"/>
+          <w:sz w:val="19"/>
+          <w:szCs w:val="19"/>
+        </w:rPr>
+        <w:t xml:space="preserve">a few specific interests, such as an instrument you play or a sport you train for</w:t>
       </w:r>
     </w:p>
     <w:sectPr>

</xml_diff>

<commit_message>
feat: label Programming languages and Spoken languages
</commit_message>
<xml_diff>
--- a/cv/cv.docx
+++ b/cv/cv.docx
@@ -32,7 +32,7 @@
         </w:rPr>
         <w:t xml:space="preserve">  |  </w:t>
       </w:r>
-      <w:hyperlink w:history="1" r:id="rId6aiato4aw_adagetim2xa">
+      <w:hyperlink w:history="1" r:id="rIdnkam6xddk02uykfarlled">
         <w:r>
           <w:rPr>
             <w:rStyle w:val="Hyperlink"/>
@@ -51,7 +51,7 @@
         </w:rPr>
         <w:t xml:space="preserve">  |  </w:t>
       </w:r>
-      <w:hyperlink w:history="1" r:id="rId_cpp_cxnhdwviyrtb1w_p">
+      <w:hyperlink w:history="1" r:id="rIdqfwdq-i_iqnaetj7uadxr">
         <w:r>
           <w:rPr>
             <w:rStyle w:val="Hyperlink"/>
@@ -67,7 +67,7 @@
       <w:pPr>
         <w:spacing w:after="60"/>
       </w:pPr>
-      <w:hyperlink w:history="1" r:id="rIdddhljnx7vvac8ly8imgiz">
+      <w:hyperlink w:history="1" r:id="rIdomes27xnhrvdxirszrf4w">
         <w:r>
           <w:rPr>
             <w:rStyle w:val="Hyperlink"/>
@@ -86,7 +86,7 @@
         </w:rPr>
         <w:t xml:space="preserve">  |  </w:t>
       </w:r>
-      <w:hyperlink w:history="1" r:id="rIdgwidy_tbvhefmpoi_smuj">
+      <w:hyperlink w:history="1" r:id="rId7ukl9hvp8fuyt3efq5dr7">
         <w:r>
           <w:rPr>
             <w:rStyle w:val="Hyperlink"/>
@@ -105,7 +105,7 @@
         </w:rPr>
         <w:t xml:space="preserve">  |  </w:t>
       </w:r>
-      <w:hyperlink w:history="1" r:id="rIdgjvaspbijqiyf2qlcyev7">
+      <w:hyperlink w:history="1" r:id="rIdf7kjynzts1oq0kgloetke">
         <w:r>
           <w:rPr>
             <w:rStyle w:val="Hyperlink"/>
@@ -466,7 +466,7 @@
           <w:sz w:val="19"/>
           <w:szCs w:val="19"/>
         </w:rPr>
-        <w:t xml:space="preserve">Languages: </w:t>
+        <w:t xml:space="preserve">Programming languages: </w:t>
       </w:r>
       <w:r>
         <w:rPr>
@@ -563,7 +563,7 @@
         </w:rPr>
         <w:t xml:space="preserve">	</w:t>
       </w:r>
-      <w:hyperlink w:history="1" r:id="rIdhxnlfxpdxumpt1_l4e70q">
+      <w:hyperlink w:history="1" r:id="rIdy-u1de6fke_qesevs8dma">
         <w:r>
           <w:rPr>
             <w:rStyle w:val="Hyperlink"/>
@@ -582,7 +582,7 @@
         </w:rPr>
         <w:t xml:space="preserve"> | </w:t>
       </w:r>
-      <w:hyperlink w:history="1" r:id="rIdwhpqyrbw-aew6lvvuwp-u">
+      <w:hyperlink w:history="1" r:id="rIdtohpxmecnppak0lyy-m_6">
         <w:r>
           <w:rPr>
             <w:rStyle w:val="Hyperlink"/>
@@ -601,7 +601,7 @@
         </w:rPr>
         <w:t xml:space="preserve"> | </w:t>
       </w:r>
-      <w:hyperlink w:history="1" r:id="rIdvacqel75-iq2tkioaz8vs">
+      <w:hyperlink w:history="1" r:id="rIdnixkn64lfgr46vimlqrl7">
         <w:r>
           <w:rPr>
             <w:rStyle w:val="Hyperlink"/>
@@ -719,7 +719,7 @@
         </w:rPr>
         <w:t xml:space="preserve">	</w:t>
       </w:r>
-      <w:hyperlink w:history="1" r:id="rIdt2gcwylmw5hyju9yprls1">
+      <w:hyperlink w:history="1" r:id="rIdbihekhcuddtwt_a2n4vhv">
         <w:r>
           <w:rPr>
             <w:rStyle w:val="Hyperlink"/>
@@ -738,7 +738,7 @@
         </w:rPr>
         <w:t xml:space="preserve"> | </w:t>
       </w:r>
-      <w:hyperlink w:history="1" r:id="rIdjdlukp4wtfq3bxwyca-3l">
+      <w:hyperlink w:history="1" r:id="rIdrqaqqeiq0siwfqp_as0jm">
         <w:r>
           <w:rPr>
             <w:rStyle w:val="Hyperlink"/>
@@ -856,7 +856,7 @@
         </w:rPr>
         <w:t xml:space="preserve">	</w:t>
       </w:r>
-      <w:hyperlink w:history="1" r:id="rId3r65gun4jtv-248j-sjku">
+      <w:hyperlink w:history="1" r:id="rIdghbo0gehxwypayy4lx7im">
         <w:r>
           <w:rPr>
             <w:rStyle w:val="Hyperlink"/>
@@ -1167,7 +1167,7 @@
         </w:rPr>
         <w:t xml:space="preserve">	</w:t>
       </w:r>
-      <w:hyperlink w:history="1" r:id="rId-u-knj1vzjn1ff84w6oxw">
+      <w:hyperlink w:history="1" r:id="rId27u6ztzlecaicu6swls_e">
         <w:r>
           <w:rPr>
             <w:rStyle w:val="Hyperlink"/>
@@ -1186,7 +1186,7 @@
         </w:rPr>
         <w:t xml:space="preserve"> | </w:t>
       </w:r>
-      <w:hyperlink w:history="1" r:id="rIdtnzuoqfb1u0m97us9fpud">
+      <w:hyperlink w:history="1" r:id="rId-ivwuqoik7spdq51820eh">
         <w:r>
           <w:rPr>
             <w:rStyle w:val="Hyperlink"/>
@@ -1324,7 +1324,7 @@
         </w:rPr>
         <w:t xml:space="preserve">: </w:t>
       </w:r>
-      <w:hyperlink w:history="1" r:id="rId4j03oh2iwgv9hmuf8aeis">
+      <w:hyperlink w:history="1" r:id="rId3atw404a_gg7z2zy9uwx_">
         <w:r>
           <w:rPr>
             <w:rStyle w:val="Hyperlink"/>
@@ -1365,7 +1365,7 @@
           <w:sz w:val="19"/>
           <w:szCs w:val="19"/>
         </w:rPr>
-        <w:t xml:space="preserve">Languages: </w:t>
+        <w:t xml:space="preserve">Spoken languages: </w:t>
       </w:r>
       <w:r>
         <w:rPr>

</xml_diff>

<commit_message>
feat: add Additional Information and skills lines (#23)
* feat: add Additional Information and skills lines

Closes #22

* feat: label Programming languages and Spoken languages
</commit_message>
<xml_diff>
--- a/cv/cv.docx
+++ b/cv/cv.docx
@@ -32,7 +32,7 @@
         </w:rPr>
         <w:t xml:space="preserve">  |  </w:t>
       </w:r>
-      <w:hyperlink w:history="1" r:id="rIdkjjz1ouxn7mtrn269eafo">
+      <w:hyperlink w:history="1" r:id="rIdnkam6xddk02uykfarlled">
         <w:r>
           <w:rPr>
             <w:rStyle w:val="Hyperlink"/>
@@ -51,7 +51,7 @@
         </w:rPr>
         <w:t xml:space="preserve">  |  </w:t>
       </w:r>
-      <w:hyperlink w:history="1" r:id="rId1cz7cn59xrxcrocdlo0n-">
+      <w:hyperlink w:history="1" r:id="rIdqfwdq-i_iqnaetj7uadxr">
         <w:r>
           <w:rPr>
             <w:rStyle w:val="Hyperlink"/>
@@ -67,7 +67,7 @@
       <w:pPr>
         <w:spacing w:after="60"/>
       </w:pPr>
-      <w:hyperlink w:history="1" r:id="rIdzt-e7ssdzpo3xb1kbljcd">
+      <w:hyperlink w:history="1" r:id="rIdomes27xnhrvdxirszrf4w">
         <w:r>
           <w:rPr>
             <w:rStyle w:val="Hyperlink"/>
@@ -86,7 +86,7 @@
         </w:rPr>
         <w:t xml:space="preserve">  |  </w:t>
       </w:r>
-      <w:hyperlink w:history="1" r:id="rIdbrt0hggyvpmh6khu9peu3">
+      <w:hyperlink w:history="1" r:id="rId7ukl9hvp8fuyt3efq5dr7">
         <w:r>
           <w:rPr>
             <w:rStyle w:val="Hyperlink"/>
@@ -105,7 +105,7 @@
         </w:rPr>
         <w:t xml:space="preserve">  |  </w:t>
       </w:r>
-      <w:hyperlink w:history="1" r:id="rIdgschmv9mllcfi7iljv0f0">
+      <w:hyperlink w:history="1" r:id="rIdf7kjynzts1oq0kgloetke">
         <w:r>
           <w:rPr>
             <w:rStyle w:val="Hyperlink"/>
@@ -466,7 +466,7 @@
           <w:sz w:val="19"/>
           <w:szCs w:val="19"/>
         </w:rPr>
-        <w:t xml:space="preserve">Languages: </w:t>
+        <w:t xml:space="preserve">Programming languages: </w:t>
       </w:r>
       <w:r>
         <w:rPr>
@@ -563,7 +563,7 @@
         </w:rPr>
         <w:t xml:space="preserve">	</w:t>
       </w:r>
-      <w:hyperlink w:history="1" r:id="rIdkkuciev6iuusffugpo8xf">
+      <w:hyperlink w:history="1" r:id="rIdy-u1de6fke_qesevs8dma">
         <w:r>
           <w:rPr>
             <w:rStyle w:val="Hyperlink"/>
@@ -582,7 +582,7 @@
         </w:rPr>
         <w:t xml:space="preserve"> | </w:t>
       </w:r>
-      <w:hyperlink w:history="1" r:id="rIdcycvg-94a46b1o4r66iip">
+      <w:hyperlink w:history="1" r:id="rIdtohpxmecnppak0lyy-m_6">
         <w:r>
           <w:rPr>
             <w:rStyle w:val="Hyperlink"/>
@@ -601,7 +601,7 @@
         </w:rPr>
         <w:t xml:space="preserve"> | </w:t>
       </w:r>
-      <w:hyperlink w:history="1" r:id="rIdhl4mhdj2oiofymsyfce5h">
+      <w:hyperlink w:history="1" r:id="rIdnixkn64lfgr46vimlqrl7">
         <w:r>
           <w:rPr>
             <w:rStyle w:val="Hyperlink"/>
@@ -719,7 +719,7 @@
         </w:rPr>
         <w:t xml:space="preserve">	</w:t>
       </w:r>
-      <w:hyperlink w:history="1" r:id="rIdddmisar9th1kibfnkdfc3">
+      <w:hyperlink w:history="1" r:id="rIdbihekhcuddtwt_a2n4vhv">
         <w:r>
           <w:rPr>
             <w:rStyle w:val="Hyperlink"/>
@@ -738,7 +738,7 @@
         </w:rPr>
         <w:t xml:space="preserve"> | </w:t>
       </w:r>
-      <w:hyperlink w:history="1" r:id="rIdmh-plxilwnzrt2ovumk5p">
+      <w:hyperlink w:history="1" r:id="rIdrqaqqeiq0siwfqp_as0jm">
         <w:r>
           <w:rPr>
             <w:rStyle w:val="Hyperlink"/>
@@ -856,7 +856,7 @@
         </w:rPr>
         <w:t xml:space="preserve">	</w:t>
       </w:r>
-      <w:hyperlink w:history="1" r:id="rIdypapdp7_92cjkeedreo_b">
+      <w:hyperlink w:history="1" r:id="rIdghbo0gehxwypayy4lx7im">
         <w:r>
           <w:rPr>
             <w:rStyle w:val="Hyperlink"/>
@@ -1019,6 +1019,93 @@
     </w:p>
     <w:p>
       <w:pPr>
+        <w:keepNext/>
+        <w:pBdr>
+          <w:bottom w:val="single" w:color="111111" w:sz="6" w:space="1"/>
+        </w:pBdr>
+        <w:spacing w:after="50" w:before="150"/>
+      </w:pPr>
+      <w:r>
+        <w:rPr>
+          <w:rFonts w:ascii="Arial" w:cs="Arial" w:eastAsia="Arial" w:hAnsi="Arial"/>
+          <w:b/>
+          <w:bCs/>
+          <w:smallCaps/>
+          <w:sz w:val="23"/>
+          <w:szCs w:val="23"/>
+        </w:rPr>
+        <w:t xml:space="preserve">Leadership and Volunteering</w:t>
+      </w:r>
+    </w:p>
+    <w:p>
+      <w:pPr>
+        <w:keepNext/>
+        <w:tabs>
+          <w:tab w:val="right" w:pos="10432"/>
+        </w:tabs>
+        <w:spacing w:before="70"/>
+      </w:pPr>
+      <w:r>
+        <w:rPr>
+          <w:rFonts w:ascii="Arial" w:cs="Arial" w:eastAsia="Arial" w:hAnsi="Arial"/>
+          <w:b/>
+          <w:bCs/>
+          <w:sz w:val="20"/>
+          <w:szCs w:val="20"/>
+        </w:rPr>
+        <w:t xml:space="preserve">Society or Volunteer Role</w:t>
+      </w:r>
+      <w:r>
+        <w:rPr>
+          <w:rFonts w:ascii="Arial" w:cs="Arial" w:eastAsia="Arial" w:hAnsi="Arial"/>
+          <w:sz w:val="19"/>
+          <w:szCs w:val="19"/>
+        </w:rPr>
+        <w:t xml:space="preserve">	</w:t>
+      </w:r>
+      <w:r>
+        <w:rPr>
+          <w:rFonts w:ascii="Arial" w:cs="Arial" w:eastAsia="Arial" w:hAnsi="Arial"/>
+          <w:b/>
+          <w:bCs/>
+          <w:i/>
+          <w:iCs/>
+          <w:sz w:val="19"/>
+          <w:szCs w:val="19"/>
+        </w:rPr>
+        <w:t xml:space="preserve">Organisation Name</w:t>
+      </w:r>
+    </w:p>
+    <w:p>
+      <w:pPr>
+        <w:keepNext/>
+        <w:tabs>
+          <w:tab w:val="right" w:pos="10432"/>
+        </w:tabs>
+      </w:pPr>
+      <w:r>
+        <w:rPr>
+          <w:rFonts w:ascii="Arial" w:cs="Arial" w:eastAsia="Arial" w:hAnsi="Arial"/>
+          <w:i/>
+          <w:iCs/>
+          <w:sz w:val="19"/>
+          <w:szCs w:val="19"/>
+        </w:rPr>
+        <w:t xml:space="preserve">Three skills this role used</w:t>
+      </w:r>
+      <w:r>
+        <w:rPr>
+          <w:rFonts w:ascii="Arial" w:cs="Arial" w:eastAsia="Arial" w:hAnsi="Arial"/>
+          <w:i/>
+          <w:iCs/>
+          <w:sz w:val="19"/>
+          <w:szCs w:val="19"/>
+        </w:rPr>
+        <w:t xml:space="preserve">	Month Year - Present</w:t>
+      </w:r>
+    </w:p>
+    <w:p>
+      <w:pPr>
         <w:pStyle w:val="ListParagraph"/>
         <w:numPr>
           <w:ilvl w:val="0"/>
@@ -1031,7 +1118,7 @@
           <w:sz w:val="19"/>
           <w:szCs w:val="19"/>
         </w:rPr>
-        <w:t xml:space="preserve">Something you improved or were trusted with</w:t>
+        <w:t xml:space="preserve">What you lead or do and who it helps, with a number where you have one</w:t>
       </w:r>
     </w:p>
     <w:p>
@@ -1051,7 +1138,7 @@
           <w:sz w:val="23"/>
           <w:szCs w:val="23"/>
         </w:rPr>
-        <w:t xml:space="preserve">Leadership and Volunteering</w:t>
+        <w:t xml:space="preserve">Research and Publications</w:t>
       </w:r>
     </w:p>
     <w:p>
@@ -1070,7 +1157,7 @@
           <w:sz w:val="20"/>
           <w:szCs w:val="20"/>
         </w:rPr>
-        <w:t xml:space="preserve">Society or Volunteer Role</w:t>
+        <w:t xml:space="preserve">Publication or Report Title</w:t>
       </w:r>
       <w:r>
         <w:rPr>
@@ -1080,101 +1167,7 @@
         </w:rPr>
         <w:t xml:space="preserve">	</w:t>
       </w:r>
-      <w:r>
-        <w:rPr>
-          <w:rFonts w:ascii="Arial" w:cs="Arial" w:eastAsia="Arial" w:hAnsi="Arial"/>
-          <w:b/>
-          <w:bCs/>
-          <w:i/>
-          <w:iCs/>
-          <w:sz w:val="19"/>
-          <w:szCs w:val="19"/>
-        </w:rPr>
-        <w:t xml:space="preserve">Organisation Name</w:t>
-      </w:r>
-    </w:p>
-    <w:p>
-      <w:pPr>
-        <w:keepNext/>
-        <w:tabs>
-          <w:tab w:val="right" w:pos="10432"/>
-        </w:tabs>
-      </w:pPr>
-      <w:r>
-        <w:rPr>
-          <w:rFonts w:ascii="Arial" w:cs="Arial" w:eastAsia="Arial" w:hAnsi="Arial"/>
-          <w:i/>
-          <w:iCs/>
-          <w:sz w:val="19"/>
-          <w:szCs w:val="19"/>
-        </w:rPr>
-        <w:t xml:space="preserve">	Month Year - Present</w:t>
-      </w:r>
-    </w:p>
-    <w:p>
-      <w:pPr>
-        <w:pStyle w:val="ListParagraph"/>
-        <w:numPr>
-          <w:ilvl w:val="0"/>
-          <w:numId w:val="2"/>
-        </w:numPr>
-      </w:pPr>
-      <w:r>
-        <w:rPr>
-          <w:rFonts w:ascii="Arial" w:cs="Arial" w:eastAsia="Arial" w:hAnsi="Arial"/>
-          <w:sz w:val="19"/>
-          <w:szCs w:val="19"/>
-        </w:rPr>
-        <w:t xml:space="preserve">What you lead or do and who it helps, with a number where you have one</w:t>
-      </w:r>
-    </w:p>
-    <w:p>
-      <w:pPr>
-        <w:keepNext/>
-        <w:pBdr>
-          <w:bottom w:val="single" w:color="111111" w:sz="6" w:space="1"/>
-        </w:pBdr>
-        <w:spacing w:after="50" w:before="150"/>
-      </w:pPr>
-      <w:r>
-        <w:rPr>
-          <w:rFonts w:ascii="Arial" w:cs="Arial" w:eastAsia="Arial" w:hAnsi="Arial"/>
-          <w:b/>
-          <w:bCs/>
-          <w:smallCaps/>
-          <w:sz w:val="23"/>
-          <w:szCs w:val="23"/>
-        </w:rPr>
-        <w:t xml:space="preserve">Research and Publications</w:t>
-      </w:r>
-    </w:p>
-    <w:p>
-      <w:pPr>
-        <w:keepNext/>
-        <w:tabs>
-          <w:tab w:val="right" w:pos="10432"/>
-        </w:tabs>
-        <w:spacing w:before="70"/>
-      </w:pPr>
-      <w:r>
-        <w:rPr>
-          <w:rFonts w:ascii="Arial" w:cs="Arial" w:eastAsia="Arial" w:hAnsi="Arial"/>
-          <w:b/>
-          <w:bCs/>
-          <w:sz w:val="20"/>
-          <w:szCs w:val="20"/>
-        </w:rPr>
-        <w:t xml:space="preserve">Publication or Report Title</w:t>
-      </w:r>
-      <w:r>
-        <w:rPr>
-          <w:rFonts w:ascii="Arial" w:cs="Arial" w:eastAsia="Arial" w:hAnsi="Arial"/>
-          <w:sz w:val="19"/>
-          <w:szCs w:val="19"/>
-        </w:rPr>
-        <w:t xml:space="preserve">	</w:t>
-      </w:r>
-      <w:hyperlink w:history="1" r:id="rIdo-ki4q-16ktlbslqtfdpa">
+      <w:hyperlink w:history="1" r:id="rId27u6ztzlecaicu6swls_e">
         <w:r>
           <w:rPr>
             <w:rStyle w:val="Hyperlink"/>
@@ -1193,7 +1186,7 @@
         </w:rPr>
         <w:t xml:space="preserve"> | </w:t>
       </w:r>
-      <w:hyperlink w:history="1" r:id="rId7fhj7owjtkmjpqrk7zczs">
+      <w:hyperlink w:history="1" r:id="rId-ivwuqoik7spdq51820eh">
         <w:r>
           <w:rPr>
             <w:rStyle w:val="Hyperlink"/>
@@ -1220,17 +1213,17 @@
           <w:sz w:val="19"/>
           <w:szCs w:val="19"/>
         </w:rPr>
-        <w:t xml:space="preserve">Full title. Your Initial. Surname, Publisher or Repository, Year</w:t>
-      </w:r>
-      <w:r>
-        <w:rPr>
-          <w:rFonts w:ascii="Arial" w:cs="Arial" w:eastAsia="Arial" w:hAnsi="Arial"/>
-          <w:i/>
-          <w:iCs/>
-          <w:sz w:val="19"/>
-          <w:szCs w:val="19"/>
-        </w:rPr>
-        <w:t xml:space="preserve">	</w:t>
+        <w:t xml:space="preserve">Type of work: Full Title</w:t>
+      </w:r>
+      <w:r>
+        <w:rPr>
+          <w:rFonts w:ascii="Arial" w:cs="Arial" w:eastAsia="Arial" w:hAnsi="Arial"/>
+          <w:i/>
+          <w:iCs/>
+          <w:sz w:val="19"/>
+          <w:szCs w:val="19"/>
+        </w:rPr>
+        <w:t xml:space="preserve">	Publisher or Repository, Month Year</w:t>
       </w:r>
     </w:p>
     <w:p>
@@ -1331,7 +1324,7 @@
         </w:rPr>
         <w:t xml:space="preserve">: </w:t>
       </w:r>
-      <w:hyperlink w:history="1" r:id="rIdkbmgnu7ltqifmiee2ucml">
+      <w:hyperlink w:history="1" r:id="rId3atw404a_gg7z2zy9uwx_">
         <w:r>
           <w:rPr>
             <w:rStyle w:val="Hyperlink"/>
@@ -1360,10 +1353,20 @@
           <w:sz w:val="23"/>
           <w:szCs w:val="23"/>
         </w:rPr>
-        <w:t xml:space="preserve">Spoken Languages</w:t>
-      </w:r>
-    </w:p>
-    <w:p>
+        <w:t xml:space="preserve">Additional Information</w:t>
+      </w:r>
+    </w:p>
+    <w:p>
+      <w:r>
+        <w:rPr>
+          <w:rFonts w:ascii="Arial" w:cs="Arial" w:eastAsia="Arial" w:hAnsi="Arial"/>
+          <w:b/>
+          <w:bCs/>
+          <w:sz w:val="19"/>
+          <w:szCs w:val="19"/>
+        </w:rPr>
+        <w:t xml:space="preserve">Spoken languages: </w:t>
+      </w:r>
       <w:r>
         <w:rPr>
           <w:rFonts w:ascii="Arial" w:cs="Arial" w:eastAsia="Arial" w:hAnsi="Arial"/>
@@ -1371,6 +1374,46 @@
           <w:szCs w:val="19"/>
         </w:rPr>
         <w:t xml:space="preserve">Language (fluent), Language (conversational)</w:t>
+      </w:r>
+    </w:p>
+    <w:p>
+      <w:r>
+        <w:rPr>
+          <w:rFonts w:ascii="Arial" w:cs="Arial" w:eastAsia="Arial" w:hAnsi="Arial"/>
+          <w:b/>
+          <w:bCs/>
+          <w:sz w:val="19"/>
+          <w:szCs w:val="19"/>
+        </w:rPr>
+        <w:t xml:space="preserve">Certifications: </w:t>
+      </w:r>
+      <w:r>
+        <w:rPr>
+          <w:rFonts w:ascii="Arial" w:cs="Arial" w:eastAsia="Arial" w:hAnsi="Arial"/>
+          <w:sz w:val="19"/>
+          <w:szCs w:val="19"/>
+        </w:rPr>
+        <w:t xml:space="preserve">Certificate Name (Issuer, Year)</w:t>
+      </w:r>
+    </w:p>
+    <w:p>
+      <w:r>
+        <w:rPr>
+          <w:rFonts w:ascii="Arial" w:cs="Arial" w:eastAsia="Arial" w:hAnsi="Arial"/>
+          <w:b/>
+          <w:bCs/>
+          <w:sz w:val="19"/>
+          <w:szCs w:val="19"/>
+        </w:rPr>
+        <w:t xml:space="preserve">Interests: </w:t>
+      </w:r>
+      <w:r>
+        <w:rPr>
+          <w:rFonts w:ascii="Arial" w:cs="Arial" w:eastAsia="Arial" w:hAnsi="Arial"/>
+          <w:sz w:val="19"/>
+          <w:szCs w:val="19"/>
+        </w:rPr>
+        <w:t xml:space="preserve">a few specific interests, such as an instrument you play or a sport you train for</w:t>
       </w:r>
     </w:p>
     <w:sectPr>

</xml_diff>